<commit_message>
Embed Vazirmatn font, fix dark-theme colors, update phase durations and pricing
- Embed Vazirmatn (Regular/Medium/Bold) as data URIs so the font works
  offline and under the artifact CSP.
- Fix a color-token bug: split an always-dark surface token from the
  heading-text token so tables, price card, and footer no longer wash
  out in dark mode; refine the dark palette.
- Update phases to 10/20/15 days and per-phase pricing (65M/110M/90M,
  total 265M) across both the HTML and the Word build.

Co-Authored-By: Claude Opus 4.8 <noreply@anthropic.com>
Claude-Session: https://claude.ai/code/session_01MPAxuqCqMDFFvD4hFtwauN
</commit_message>
<xml_diff>
--- a/proposal/proposal.docx
+++ b/proposal/proposal.docx
@@ -525,7 +525,7 @@
           <w:sz w:val="22"/>
           <w:szCs w:val="22"/>
         </w:rPr>
-        <w:t xml:space="preserve">این پروژه در سه فاز پانزده‌روزه اجرا می‌شود و پس از استقرار، پشتیبانی و توسعهٔ نامحدودِ نیازهای شفاف‌سازی به‌صورت ماهیانه ارائه می‌گردد.</w:t>
+        <w:t xml:space="preserve">این پروژه در سه فاز و مجموعاً ۴۵ روز اجرا می‌شود و پس از استقرار، پشتیبانی و توسعهٔ نامحدودِ نیازهای شفاف‌سازی به‌صورت ماهیانه ارائه می‌گردد.</w:t>
       </w:r>
     </w:p>
     <w:p>
@@ -680,7 +680,7 @@
                 <w:sz w:val="21"/>
                 <w:szCs w:val="21"/>
               </w:rPr>
-              <w:t xml:space="preserve">۴۵ روز (۳ فاز × ۱۵ روز)</w:t>
+              <w:t xml:space="preserve">۴۵ روز (فاز ۱: ۱۰ روز، فاز ۲: ۲۰ روز، فاز ۳: ۱۵ روز)</w:t>
             </w:r>
           </w:p>
         </w:tc>
@@ -2045,7 +2045,7 @@
           <w:sz w:val="25"/>
           <w:szCs w:val="25"/>
         </w:rPr>
-        <w:t xml:space="preserve">فاز اول — ساخت انبار داده (Data Warehouse) | ۱۵ روز</w:t>
+        <w:t xml:space="preserve">فاز اول — ساخت انبار داده (Data Warehouse) | ۱۰ روز</w:t>
       </w:r>
     </w:p>
     <w:p>
@@ -2236,7 +2236,7 @@
           <w:sz w:val="25"/>
           <w:szCs w:val="25"/>
         </w:rPr>
-        <w:t xml:space="preserve">فاز دوم — مایگریشن و متناظرسازی (Migration &amp; Mapping) | ۱۵ روز</w:t>
+        <w:t xml:space="preserve">فاز دوم — مایگریشن و متناظرسازی (Migration &amp; Mapping) | ۲۰ روز</w:t>
       </w:r>
     </w:p>
     <w:p>
@@ -4197,7 +4197,7 @@
                 <w:sz w:val="21"/>
                 <w:szCs w:val="21"/>
               </w:rPr>
-              <w:t xml:space="preserve">۱۵ روز</w:t>
+              <w:t xml:space="preserve">۱۰ روز</w:t>
             </w:r>
           </w:p>
         </w:tc>
@@ -4228,7 +4228,7 @@
                 <w:sz w:val="21"/>
                 <w:szCs w:val="21"/>
               </w:rPr>
-              <w:t xml:space="preserve">روز ۱ تا ۱۵</w:t>
+              <w:t xml:space="preserve">روز ۱ تا ۱۰</w:t>
             </w:r>
           </w:p>
         </w:tc>
@@ -4323,7 +4323,7 @@
                 <w:sz w:val="21"/>
                 <w:szCs w:val="21"/>
               </w:rPr>
-              <w:t xml:space="preserve">۱۵ روز</w:t>
+              <w:t xml:space="preserve">۲۰ روز</w:t>
             </w:r>
           </w:p>
         </w:tc>
@@ -4354,7 +4354,7 @@
                 <w:sz w:val="21"/>
                 <w:szCs w:val="21"/>
               </w:rPr>
-              <w:t xml:space="preserve">روز ۱۶ تا ۳۰</w:t>
+              <w:t xml:space="preserve">روز ۱۱ تا ۳۰</w:t>
             </w:r>
           </w:p>
         </w:tc>
@@ -5151,7 +5151,7 @@
                 <w:sz w:val="21"/>
                 <w:szCs w:val="21"/>
               </w:rPr>
-              <w:t xml:space="preserve">اجرای فاز اول — ساخت انبار داده</w:t>
+              <w:t xml:space="preserve">اجرای فاز اول — ساخت انبار داده (۱۰ روز)</w:t>
             </w:r>
           </w:p>
         </w:tc>
@@ -5182,7 +5182,7 @@
                 <w:sz w:val="21"/>
                 <w:szCs w:val="21"/>
               </w:rPr>
-              <w:t xml:space="preserve">—</w:t>
+              <w:t xml:space="preserve">۶۵٬۰۰۰٬۰۰۰</w:t>
             </w:r>
           </w:p>
         </w:tc>
@@ -5246,7 +5246,7 @@
                 <w:sz w:val="21"/>
                 <w:szCs w:val="21"/>
               </w:rPr>
-              <w:t xml:space="preserve">اجرای فاز دوم — مایگریشن و متناظرسازی</w:t>
+              <w:t xml:space="preserve">اجرای فاز دوم — مایگریشن و متناظرسازی (۲۰ روز)</w:t>
             </w:r>
           </w:p>
         </w:tc>
@@ -5277,7 +5277,7 @@
                 <w:sz w:val="21"/>
                 <w:szCs w:val="21"/>
               </w:rPr>
-              <w:t xml:space="preserve">—</w:t>
+              <w:t xml:space="preserve">۱۱۰٬۰۰۰٬۰۰۰</w:t>
             </w:r>
           </w:p>
         </w:tc>
@@ -5341,7 +5341,7 @@
                 <w:sz w:val="21"/>
                 <w:szCs w:val="21"/>
               </w:rPr>
-              <w:t xml:space="preserve">اجرای فاز سوم — پلتفرم BI و داشبوردها</w:t>
+              <w:t xml:space="preserve">اجرای فاز سوم — پلتفرم BI و داشبوردها (۱۵ روز)</w:t>
             </w:r>
           </w:p>
         </w:tc>
@@ -5372,7 +5372,7 @@
                 <w:sz w:val="21"/>
                 <w:szCs w:val="21"/>
               </w:rPr>
-              <w:t xml:space="preserve">—</w:t>
+              <w:t xml:space="preserve">۹۰٬۰۰۰٬۰۰۰</w:t>
             </w:r>
           </w:p>
         </w:tc>
@@ -5593,7 +5593,7 @@
           <w:sz w:val="20"/>
           <w:szCs w:val="20"/>
         </w:rPr>
-        <w:t xml:space="preserve">مبلغ هر فاز در زمان عقد قرارداد بر اساس توافق طرفین از مبلغ کل تفکیک می‌شود؛ مبلغ کل قرارداد اجرا ۲۶۵ میلیون تومان است.</w:t>
+        <w:t xml:space="preserve">پرداخت مبلغ هر فاز متناسب با تحویل همان فاز انجام می‌شود؛ مبلغ کل قرارداد اجرا ۲۶۵ میلیون تومان است.</w:t>
       </w:r>
     </w:p>
     <w:p>

</xml_diff>

<commit_message>
Ground proposal in the real operations-platform modules
Reflect the actual operations platform: work-order module (LR/LB/LS/FF/
ND/UT/CI-LT/SE/PR), equipment, customers/contracts, costs & imprest,
invoicing. Reframe reconciliation as three concrete axes — consumed
items vs warehouse, invoice/revenue vs accounting, cost/imprest vs
accounting — and add a service-lines chip strip. Synced across HTML and
the Word build.

Co-Authored-By: Claude Opus 4.8 <noreply@anthropic.com>
Claude-Session: https://claude.ai/code/session_01MPAxuqCqMDFFvD4hFtwauN
</commit_message>
<xml_diff>
--- a/proposal/proposal.docx
+++ b/proposal/proposal.docx
@@ -948,9 +948,9 @@
         <w:tblLayout w:type="fixed"/>
       </w:tblPr>
       <w:tblGrid>
-        <w:gridCol w:w="2400"/>
+        <w:gridCol w:w="2200"/>
         <w:gridCol w:w="3260"/>
-        <w:gridCol w:w="3700"/>
+        <w:gridCol w:w="3900"/>
       </w:tblGrid>
       <w:tr>
         <w:trPr>
@@ -958,7 +958,7 @@
         </w:trPr>
         <w:tc>
           <w:tcPr>
-            <w:tcW w:type="dxa" w:w="2400"/>
+            <w:tcW w:type="dxa" w:w="2200"/>
             <w:shd w:fill="0B2E4F" w:color="auto" w:val="clear"/>
             <w:tcMar>
               <w:top w:type="dxa" w:w="80"/>
@@ -1020,7 +1020,7 @@
         </w:tc>
         <w:tc>
           <w:tcPr>
-            <w:tcW w:type="dxa" w:w="3700"/>
+            <w:tcW w:type="dxa" w:w="3900"/>
             <w:shd w:fill="0B2E4F" w:color="auto" w:val="clear"/>
             <w:tcMar>
               <w:top w:type="dxa" w:w="80"/>
@@ -1053,7 +1053,7 @@
       <w:tr>
         <w:tc>
           <w:tcPr>
-            <w:tcW w:type="dxa" w:w="2400"/>
+            <w:tcW w:type="dxa" w:w="2200"/>
             <w:shd w:fill="F5F9FB" w:color="auto" w:val="clear"/>
             <w:tcMar>
               <w:top w:type="dxa" w:w="80"/>
@@ -1109,13 +1109,13 @@
                 <w:sz w:val="21"/>
                 <w:szCs w:val="21"/>
               </w:rPr>
-              <w:t xml:space="preserve">ثبت هر عملیات سرویس/بازرسی لایف‌رفت</w:t>
-            </w:r>
-          </w:p>
-        </w:tc>
-        <w:tc>
-          <w:tcPr>
-            <w:tcW w:type="dxa" w:w="3700"/>
+              <w:t xml:space="preserve">ثبت دستور کار سرویس، تجهیزات، صورت‌حساب و هزینه/تنخواه</w:t>
+            </w:r>
+          </w:p>
+        </w:tc>
+        <w:tc>
+          <w:tcPr>
+            <w:tcW w:type="dxa" w:w="3900"/>
             <w:shd w:fill="F5F9FB" w:color="auto" w:val="clear"/>
             <w:tcMar>
               <w:top w:type="dxa" w:w="80"/>
@@ -1140,7 +1140,7 @@
                 <w:sz w:val="21"/>
                 <w:szCs w:val="21"/>
               </w:rPr>
-              <w:t xml:space="preserve">شناسه عملیات، مشتری، تجهیز، اقلام تعویض‌شده، شعبه</w:t>
+              <w:t xml:space="preserve">دستور کار (LR/LB/LS/FF/ND/UT/CI-LT/SE/PR)، اقلام مصرفی، صورت‌حساب، هزینه، شعبه</w:t>
             </w:r>
           </w:p>
         </w:tc>
@@ -1148,7 +1148,7 @@
       <w:tr>
         <w:tc>
           <w:tcPr>
-            <w:tcW w:type="dxa" w:w="2400"/>
+            <w:tcW w:type="dxa" w:w="2200"/>
             <w:shd w:fill="FFFFFF" w:color="auto" w:val="clear"/>
             <w:tcMar>
               <w:top w:type="dxa" w:w="80"/>
@@ -1210,7 +1210,7 @@
         </w:tc>
         <w:tc>
           <w:tcPr>
-            <w:tcW w:type="dxa" w:w="3700"/>
+            <w:tcW w:type="dxa" w:w="3900"/>
             <w:shd w:fill="FFFFFF" w:color="auto" w:val="clear"/>
             <w:tcMar>
               <w:top w:type="dxa" w:w="80"/>
@@ -1243,7 +1243,7 @@
       <w:tr>
         <w:tc>
           <w:tcPr>
-            <w:tcW w:type="dxa" w:w="2400"/>
+            <w:tcW w:type="dxa" w:w="2200"/>
             <w:shd w:fill="F5F9FB" w:color="auto" w:val="clear"/>
             <w:tcMar>
               <w:top w:type="dxa" w:w="80"/>
@@ -1299,13 +1299,13 @@
                 <w:sz w:val="21"/>
                 <w:szCs w:val="21"/>
               </w:rPr>
-              <w:t xml:space="preserve">ثبت هزینه‌ها و درآمدهای هر عملیات</w:t>
-            </w:r>
-          </w:p>
-        </w:tc>
-        <w:tc>
-          <w:tcPr>
-            <w:tcW w:type="dxa" w:w="3700"/>
+              <w:t xml:space="preserve">ثبت رسمی هزینه‌ها و درآمدها در دفاتر مالی</w:t>
+            </w:r>
+          </w:p>
+        </w:tc>
+        <w:tc>
+          <w:tcPr>
+            <w:tcW w:type="dxa" w:w="3900"/>
             <w:shd w:fill="F5F9FB" w:color="auto" w:val="clear"/>
             <w:tcMar>
               <w:top w:type="dxa" w:w="80"/>
@@ -1330,12 +1330,40 @@
                 <w:sz w:val="21"/>
                 <w:szCs w:val="21"/>
               </w:rPr>
-              <w:t xml:space="preserve">اسناد مالی، درآمد، بهای تمام‌شده، سود/زیان</w:t>
+              <w:t xml:space="preserve">اسناد و دفاتر مالی، درآمد، بهای تمام‌شده، سود/زیان</w:t>
             </w:r>
           </w:p>
         </w:tc>
       </w:tr>
     </w:tbl>
+    <w:p>
+      <w:pPr>
+        <w:spacing w:after="60"/>
+      </w:pPr>
+      <w:r>
+        <w:t xml:space="preserve"/>
+      </w:r>
+    </w:p>
+    <w:p>
+      <w:pPr>
+        <w:bidi/>
+        <w:spacing w:after="120" w:before="0" w:line="300"/>
+        <w:jc w:val="right"/>
+      </w:pPr>
+      <w:r>
+        <w:rPr>
+          <w:rFonts w:ascii="Tahoma" w:cs="Tahoma" w:eastAsia="Tahoma" w:hAnsi="Tahoma"/>
+          <w:b w:val="false"/>
+          <w:bCs w:val="false"/>
+          <w:i w:val="false"/>
+          <w:iCs w:val="false"/>
+          <w:color w:val="5A6B75"/>
+          <w:sz w:val="20"/>
+          <w:szCs w:val="20"/>
+        </w:rPr>
+        <w:t xml:space="preserve">خطوط سرویسِ ثبت‌شده در ماژول دستور کار: لایف‌رفت (LR)، لایف‌بوت (LB)، تجهیزات نجات جان (LS)، سیستم‌های اطفاء حریق (FF)، آزمایش‌های غیرمخرب (ND)، ضخامت‌سنجی (UT)، آزمایش‌های بارگذاری (CI/LT)، فروش قطعات (SE) و پروژه‌ها (PR).</w:t>
+      </w:r>
+    </w:p>
     <w:p>
       <w:pPr>
         <w:spacing w:after="120"/>
@@ -2279,7 +2307,7 @@
           <w:sz w:val="22"/>
           <w:szCs w:val="22"/>
         </w:rPr>
-        <w:t xml:space="preserve">تعریف کلید مشترک و قواعد متناظرسازی بین عملیات، خروج انبار و اسناد مالی.</w:t>
+        <w:t xml:space="preserve">تعریف کلید مشترک بین دستور کار، خروج انبار و اسناد مالی.</w:t>
       </w:r>
     </w:p>
     <w:p>
@@ -2302,7 +2330,7 @@
           <w:sz w:val="22"/>
           <w:szCs w:val="22"/>
         </w:rPr>
-        <w:t xml:space="preserve">پیاده‌سازی موتور مغایرت‌گیری سه‌جانبه (عملیات ⇄ انبار ⇄ حسابداری).</w:t>
+        <w:t xml:space="preserve">پیاده‌سازی موتور مغایرت‌گیری سه‌محوره: اقلام مصرفی ⇄ انبار، صورت‌حساب/درآمد ⇄ حسابداری، هزینه و تنخواه ⇄ حسابداری.</w:t>
       </w:r>
     </w:p>
     <w:p>
@@ -2325,7 +2353,7 @@
           <w:sz w:val="22"/>
           <w:szCs w:val="22"/>
         </w:rPr>
-        <w:t xml:space="preserve">کشف و دسته‌بندی مغایرت‌ها: اقلام کسرنشده، اسناد مالی مفقود، درآمد بدون عملیات، خطای ثبت.</w:t>
+        <w:t xml:space="preserve">کشف و دسته‌بندی مغایرت‌ها: قلم کسرنشده، سند مالی مفقود، درآمد بدون دستور کار، مغایرت تنخواه، خطای ثبت.</w:t>
       </w:r>
     </w:p>
     <w:p>

</xml_diff>

<commit_message>
Add system breadth/complexity + challenges sections, raise pricing 30%, set executor name
- Expand current-state into full profiles of all three systems (modules,
  complexity notes) and add a dedicated integration-challenges section.
- Raise execution pricing by 30% (phases 84.5M/143M/117M, total 344.5M)
  and monthly support to 32.5M, across HTML and Word.
- Set executor company to 'فناوران فرایند فردا' in header and signature.

Co-Authored-By: Claude Opus 4.8 <noreply@anthropic.com>
Claude-Session: https://claude.ai/code/session_01MPAxuqCqMDFFvD4hFtwauN
</commit_message>
<xml_diff>
--- a/proposal/proposal.docx
+++ b/proposal/proposal.docx
@@ -194,7 +194,7 @@
                 <w:sz w:val="21"/>
                 <w:szCs w:val="21"/>
               </w:rPr>
-              <w:t xml:space="preserve">[نام شرکت مجری — محل درج لوگو و مشخصات]</w:t>
+              <w:t xml:space="preserve">شرکت فناوران فرایند فردا</w:t>
             </w:r>
           </w:p>
         </w:tc>
@@ -744,7 +744,7 @@
                 <w:sz w:val="21"/>
                 <w:szCs w:val="21"/>
               </w:rPr>
-              <w:t xml:space="preserve">۲۶۵٬۰۰۰٬۰۰۰ تومان</w:t>
+              <w:t xml:space="preserve">۳۴۴٬۵۰۰٬۰۰۰ تومان</w:t>
             </w:r>
           </w:p>
         </w:tc>
@@ -808,7 +808,7 @@
                 <w:sz w:val="21"/>
                 <w:szCs w:val="21"/>
               </w:rPr>
-              <w:t xml:space="preserve">۲۵٬۰۰۰٬۰۰۰ تومان در ماه</w:t>
+              <w:t xml:space="preserve">۳۲٬۵۰۰٬۰۰۰ تومان در ماه</w:t>
             </w:r>
           </w:p>
         </w:tc>
@@ -1503,6 +1503,659 @@
         <w:t xml:space="preserve">مقایسهٔ عملکرد و سودآوری بین شعب عملاً ناممکن است.</w:t>
       </w:r>
     </w:p>
+    <w:p>
+      <w:pPr>
+        <w:spacing w:after="120"/>
+      </w:pPr>
+      <w:r>
+        <w:t xml:space="preserve"/>
+      </w:r>
+    </w:p>
+    <w:p>
+      <w:pPr>
+        <w:pStyle w:val="Heading2"/>
+        <w:bidi/>
+        <w:spacing w:after="100" w:before="200" w:line="300"/>
+        <w:jc w:val="right"/>
+      </w:pPr>
+      <w:r>
+        <w:rPr>
+          <w:rFonts w:ascii="Tahoma" w:cs="Tahoma" w:eastAsia="Tahoma" w:hAnsi="Tahoma"/>
+          <w:b/>
+          <w:bCs/>
+          <w:color w:val="0E7C86"/>
+          <w:sz w:val="25"/>
+          <w:szCs w:val="25"/>
+        </w:rPr>
+        <w:t xml:space="preserve">۲٫۲. چالش‌های یکپارچه‌سازی</w:t>
+      </w:r>
+    </w:p>
+    <w:p>
+      <w:pPr>
+        <w:bidi/>
+        <w:spacing w:after="120" w:before="0" w:line="300"/>
+        <w:jc w:val="right"/>
+      </w:pPr>
+      <w:r>
+        <w:rPr>
+          <w:rFonts w:ascii="Tahoma" w:cs="Tahoma" w:eastAsia="Tahoma" w:hAnsi="Tahoma"/>
+          <w:b w:val="false"/>
+          <w:bCs w:val="false"/>
+          <w:i w:val="false"/>
+          <w:iCs w:val="false"/>
+          <w:color w:val="1A1A1A"/>
+          <w:sz w:val="22"/>
+          <w:szCs w:val="22"/>
+        </w:rPr>
+        <w:t xml:space="preserve">این‌ها همان موانعی هستند که تا امروز مانع خواندنِ خودکارِ سه سامانه شده‌اند و پروژه دقیقاً برای حل آن‌ها طراحی شده است:</w:t>
+      </w:r>
+    </w:p>
+    <w:p>
+      <w:pPr>
+        <w:spacing w:after="40"/>
+      </w:pPr>
+      <w:r>
+        <w:t xml:space="preserve"/>
+      </w:r>
+    </w:p>
+    <w:tbl>
+      <w:tblPr>
+        <w:bidiVisual/>
+        <w:tblW w:type="dxa" w:w="9360"/>
+        <w:tblBorders>
+          <w:top w:val="single" w:color="CFE0E7" w:sz="4"/>
+          <w:left w:val="single" w:color="CFE0E7" w:sz="4"/>
+          <w:bottom w:val="single" w:color="CFE0E7" w:sz="4"/>
+          <w:right w:val="single" w:color="CFE0E7" w:sz="4"/>
+          <w:insideH w:val="single" w:color="CFE0E7" w:sz="4"/>
+          <w:insideV w:val="single" w:color="CFE0E7" w:sz="4"/>
+        </w:tblBorders>
+        <w:tblLayout w:type="fixed"/>
+      </w:tblPr>
+      <w:tblGrid>
+        <w:gridCol w:w="2900"/>
+        <w:gridCol w:w="6460"/>
+      </w:tblGrid>
+      <w:tr>
+        <w:trPr>
+          <w:tblHeader/>
+        </w:trPr>
+        <w:tc>
+          <w:tcPr>
+            <w:tcW w:type="dxa" w:w="2900"/>
+            <w:shd w:fill="0B2E4F" w:color="auto" w:val="clear"/>
+            <w:tcMar>
+              <w:top w:type="dxa" w:w="80"/>
+              <w:left w:type="dxa" w:w="90"/>
+              <w:bottom w:type="dxa" w:w="80"/>
+              <w:right w:type="dxa" w:w="90"/>
+            </w:tcMar>
+            <w:vAlign w:val="center"/>
+          </w:tcPr>
+          <w:p>
+            <w:pPr>
+              <w:bidi/>
+              <w:spacing w:after="0" w:line="280"/>
+              <w:jc w:val="center"/>
+            </w:pPr>
+            <w:r>
+              <w:rPr>
+                <w:rFonts w:ascii="Tahoma" w:cs="Tahoma" w:eastAsia="Tahoma" w:hAnsi="Tahoma"/>
+                <w:b/>
+                <w:bCs/>
+                <w:color w:val="FFFFFF"/>
+                <w:sz w:val="21"/>
+                <w:szCs w:val="21"/>
+              </w:rPr>
+              <w:t xml:space="preserve">چالش</w:t>
+            </w:r>
+          </w:p>
+        </w:tc>
+        <w:tc>
+          <w:tcPr>
+            <w:tcW w:type="dxa" w:w="6460"/>
+            <w:shd w:fill="0B2E4F" w:color="auto" w:val="clear"/>
+            <w:tcMar>
+              <w:top w:type="dxa" w:w="80"/>
+              <w:left w:type="dxa" w:w="90"/>
+              <w:bottom w:type="dxa" w:w="80"/>
+              <w:right w:type="dxa" w:w="90"/>
+            </w:tcMar>
+            <w:vAlign w:val="center"/>
+          </w:tcPr>
+          <w:p>
+            <w:pPr>
+              <w:bidi/>
+              <w:spacing w:after="0" w:line="280"/>
+              <w:jc w:val="center"/>
+            </w:pPr>
+            <w:r>
+              <w:rPr>
+                <w:rFonts w:ascii="Tahoma" w:cs="Tahoma" w:eastAsia="Tahoma" w:hAnsi="Tahoma"/>
+                <w:b/>
+                <w:bCs/>
+                <w:color w:val="FFFFFF"/>
+                <w:sz w:val="21"/>
+                <w:szCs w:val="21"/>
+              </w:rPr>
+              <w:t xml:space="preserve">شرح</w:t>
+            </w:r>
+          </w:p>
+        </w:tc>
+      </w:tr>
+      <w:tr>
+        <w:tc>
+          <w:tcPr>
+            <w:tcW w:type="dxa" w:w="2900"/>
+            <w:shd w:fill="F5F9FB" w:color="auto" w:val="clear"/>
+            <w:tcMar>
+              <w:top w:type="dxa" w:w="80"/>
+              <w:left w:type="dxa" w:w="90"/>
+              <w:bottom w:type="dxa" w:w="80"/>
+              <w:right w:type="dxa" w:w="90"/>
+            </w:tcMar>
+            <w:vAlign w:val="center"/>
+          </w:tcPr>
+          <w:p>
+            <w:pPr>
+              <w:bidi/>
+              <w:spacing w:after="0" w:line="280"/>
+              <w:jc w:val="right"/>
+            </w:pPr>
+            <w:r>
+              <w:rPr>
+                <w:rFonts w:ascii="Tahoma" w:cs="Tahoma" w:eastAsia="Tahoma" w:hAnsi="Tahoma"/>
+                <w:b/>
+                <w:bCs/>
+                <w:color w:val="1A1A1A"/>
+                <w:sz w:val="21"/>
+                <w:szCs w:val="21"/>
+              </w:rPr>
+              <w:t xml:space="preserve">نبود کلید مشترک</w:t>
+            </w:r>
+          </w:p>
+        </w:tc>
+        <w:tc>
+          <w:tcPr>
+            <w:tcW w:type="dxa" w:w="6460"/>
+            <w:shd w:fill="F5F9FB" w:color="auto" w:val="clear"/>
+            <w:tcMar>
+              <w:top w:type="dxa" w:w="80"/>
+              <w:left w:type="dxa" w:w="90"/>
+              <w:bottom w:type="dxa" w:w="80"/>
+              <w:right w:type="dxa" w:w="90"/>
+            </w:tcMar>
+            <w:vAlign w:val="center"/>
+          </w:tcPr>
+          <w:p>
+            <w:pPr>
+              <w:bidi/>
+              <w:spacing w:after="0" w:line="280"/>
+              <w:jc w:val="right"/>
+            </w:pPr>
+            <w:r>
+              <w:rPr>
+                <w:rFonts w:ascii="Tahoma" w:cs="Tahoma" w:eastAsia="Tahoma" w:hAnsi="Tahoma"/>
+                <w:b w:val="false"/>
+                <w:bCs w:val="false"/>
+                <w:color w:val="1A1A1A"/>
+                <w:sz w:val="21"/>
+                <w:szCs w:val="21"/>
+              </w:rPr>
+              <w:t xml:space="preserve">کد کالا در انبار، قلم در دستور کار و تفصیلی در حسابداری شناسهٔ مشترک ندارند.</w:t>
+            </w:r>
+          </w:p>
+        </w:tc>
+      </w:tr>
+      <w:tr>
+        <w:tc>
+          <w:tcPr>
+            <w:tcW w:type="dxa" w:w="2900"/>
+            <w:shd w:fill="FFFFFF" w:color="auto" w:val="clear"/>
+            <w:tcMar>
+              <w:top w:type="dxa" w:w="80"/>
+              <w:left w:type="dxa" w:w="90"/>
+              <w:bottom w:type="dxa" w:w="80"/>
+              <w:right w:type="dxa" w:w="90"/>
+            </w:tcMar>
+            <w:vAlign w:val="center"/>
+          </w:tcPr>
+          <w:p>
+            <w:pPr>
+              <w:bidi/>
+              <w:spacing w:after="0" w:line="280"/>
+              <w:jc w:val="right"/>
+            </w:pPr>
+            <w:r>
+              <w:rPr>
+                <w:rFonts w:ascii="Tahoma" w:cs="Tahoma" w:eastAsia="Tahoma" w:hAnsi="Tahoma"/>
+                <w:b/>
+                <w:bCs/>
+                <w:color w:val="1A1A1A"/>
+                <w:sz w:val="21"/>
+                <w:szCs w:val="21"/>
+              </w:rPr>
+              <w:t xml:space="preserve">داده در چند شعبه</w:t>
+            </w:r>
+          </w:p>
+        </w:tc>
+        <w:tc>
+          <w:tcPr>
+            <w:tcW w:type="dxa" w:w="6460"/>
+            <w:shd w:fill="FFFFFF" w:color="auto" w:val="clear"/>
+            <w:tcMar>
+              <w:top w:type="dxa" w:w="80"/>
+              <w:left w:type="dxa" w:w="90"/>
+              <w:bottom w:type="dxa" w:w="80"/>
+              <w:right w:type="dxa" w:w="90"/>
+            </w:tcMar>
+            <w:vAlign w:val="center"/>
+          </w:tcPr>
+          <w:p>
+            <w:pPr>
+              <w:bidi/>
+              <w:spacing w:after="0" w:line="280"/>
+              <w:jc w:val="right"/>
+            </w:pPr>
+            <w:r>
+              <w:rPr>
+                <w:rFonts w:ascii="Tahoma" w:cs="Tahoma" w:eastAsia="Tahoma" w:hAnsi="Tahoma"/>
+                <w:b w:val="false"/>
+                <w:bCs w:val="false"/>
+                <w:color w:val="1A1A1A"/>
+                <w:sz w:val="21"/>
+                <w:szCs w:val="21"/>
+              </w:rPr>
+              <w:t xml:space="preserve">هر شعبه داده و گاهی نمونهٔ نرم‌افزار جداگانه دارد؛ نیازمند تجمیع و یکدست‌سازی.</w:t>
+            </w:r>
+          </w:p>
+        </w:tc>
+      </w:tr>
+      <w:tr>
+        <w:tc>
+          <w:tcPr>
+            <w:tcW w:type="dxa" w:w="2900"/>
+            <w:shd w:fill="F5F9FB" w:color="auto" w:val="clear"/>
+            <w:tcMar>
+              <w:top w:type="dxa" w:w="80"/>
+              <w:left w:type="dxa" w:w="90"/>
+              <w:bottom w:type="dxa" w:w="80"/>
+              <w:right w:type="dxa" w:w="90"/>
+            </w:tcMar>
+            <w:vAlign w:val="center"/>
+          </w:tcPr>
+          <w:p>
+            <w:pPr>
+              <w:bidi/>
+              <w:spacing w:after="0" w:line="280"/>
+              <w:jc w:val="right"/>
+            </w:pPr>
+            <w:r>
+              <w:rPr>
+                <w:rFonts w:ascii="Tahoma" w:cs="Tahoma" w:eastAsia="Tahoma" w:hAnsi="Tahoma"/>
+                <w:b/>
+                <w:bCs/>
+                <w:color w:val="1A1A1A"/>
+                <w:sz w:val="21"/>
+                <w:szCs w:val="21"/>
+              </w:rPr>
+              <w:t xml:space="preserve">اختلاف زمانی ثبت</w:t>
+            </w:r>
+          </w:p>
+        </w:tc>
+        <w:tc>
+          <w:tcPr>
+            <w:tcW w:type="dxa" w:w="6460"/>
+            <w:shd w:fill="F5F9FB" w:color="auto" w:val="clear"/>
+            <w:tcMar>
+              <w:top w:type="dxa" w:w="80"/>
+              <w:left w:type="dxa" w:w="90"/>
+              <w:bottom w:type="dxa" w:w="80"/>
+              <w:right w:type="dxa" w:w="90"/>
+            </w:tcMar>
+            <w:vAlign w:val="center"/>
+          </w:tcPr>
+          <w:p>
+            <w:pPr>
+              <w:bidi/>
+              <w:spacing w:after="0" w:line="280"/>
+              <w:jc w:val="right"/>
+            </w:pPr>
+            <w:r>
+              <w:rPr>
+                <w:rFonts w:ascii="Tahoma" w:cs="Tahoma" w:eastAsia="Tahoma" w:hAnsi="Tahoma"/>
+                <w:b w:val="false"/>
+                <w:bCs w:val="false"/>
+                <w:color w:val="1A1A1A"/>
+                <w:sz w:val="21"/>
+                <w:szCs w:val="21"/>
+              </w:rPr>
+              <w:t xml:space="preserve">ثبت عملیات، خروج انبار و سند مالی هم‌زمان نیستند؛ تطبیق باید بازهٔ زمانی را لحاظ کند.</w:t>
+            </w:r>
+          </w:p>
+        </w:tc>
+      </w:tr>
+      <w:tr>
+        <w:tc>
+          <w:tcPr>
+            <w:tcW w:type="dxa" w:w="2900"/>
+            <w:shd w:fill="FFFFFF" w:color="auto" w:val="clear"/>
+            <w:tcMar>
+              <w:top w:type="dxa" w:w="80"/>
+              <w:left w:type="dxa" w:w="90"/>
+              <w:bottom w:type="dxa" w:w="80"/>
+              <w:right w:type="dxa" w:w="90"/>
+            </w:tcMar>
+            <w:vAlign w:val="center"/>
+          </w:tcPr>
+          <w:p>
+            <w:pPr>
+              <w:bidi/>
+              <w:spacing w:after="0" w:line="280"/>
+              <w:jc w:val="right"/>
+            </w:pPr>
+            <w:r>
+              <w:rPr>
+                <w:rFonts w:ascii="Tahoma" w:cs="Tahoma" w:eastAsia="Tahoma" w:hAnsi="Tahoma"/>
+                <w:b/>
+                <w:bCs/>
+                <w:color w:val="1A1A1A"/>
+                <w:sz w:val="21"/>
+                <w:szCs w:val="21"/>
+              </w:rPr>
+              <w:t xml:space="preserve">رکوردهای ناقص و تکراری</w:t>
+            </w:r>
+          </w:p>
+        </w:tc>
+        <w:tc>
+          <w:tcPr>
+            <w:tcW w:type="dxa" w:w="6460"/>
+            <w:shd w:fill="FFFFFF" w:color="auto" w:val="clear"/>
+            <w:tcMar>
+              <w:top w:type="dxa" w:w="80"/>
+              <w:left w:type="dxa" w:w="90"/>
+              <w:bottom w:type="dxa" w:w="80"/>
+              <w:right w:type="dxa" w:w="90"/>
+            </w:tcMar>
+            <w:vAlign w:val="center"/>
+          </w:tcPr>
+          <w:p>
+            <w:pPr>
+              <w:bidi/>
+              <w:spacing w:after="0" w:line="280"/>
+              <w:jc w:val="right"/>
+            </w:pPr>
+            <w:r>
+              <w:rPr>
+                <w:rFonts w:ascii="Tahoma" w:cs="Tahoma" w:eastAsia="Tahoma" w:hAnsi="Tahoma"/>
+                <w:b w:val="false"/>
+                <w:bCs w:val="false"/>
+                <w:color w:val="1A1A1A"/>
+                <w:sz w:val="21"/>
+                <w:szCs w:val="21"/>
+              </w:rPr>
+              <w:t xml:space="preserve">صورت‌حساب بدون سند مالی، خروج انبار بدون دستور کار، هزینهٔ تنخواه بدون سند.</w:t>
+            </w:r>
+          </w:p>
+        </w:tc>
+      </w:tr>
+      <w:tr>
+        <w:tc>
+          <w:tcPr>
+            <w:tcW w:type="dxa" w:w="2900"/>
+            <w:shd w:fill="F5F9FB" w:color="auto" w:val="clear"/>
+            <w:tcMar>
+              <w:top w:type="dxa" w:w="80"/>
+              <w:left w:type="dxa" w:w="90"/>
+              <w:bottom w:type="dxa" w:w="80"/>
+              <w:right w:type="dxa" w:w="90"/>
+            </w:tcMar>
+            <w:vAlign w:val="center"/>
+          </w:tcPr>
+          <w:p>
+            <w:pPr>
+              <w:bidi/>
+              <w:spacing w:after="0" w:line="280"/>
+              <w:jc w:val="right"/>
+            </w:pPr>
+            <w:r>
+              <w:rPr>
+                <w:rFonts w:ascii="Tahoma" w:cs="Tahoma" w:eastAsia="Tahoma" w:hAnsi="Tahoma"/>
+                <w:b/>
+                <w:bCs/>
+                <w:color w:val="1A1A1A"/>
+                <w:sz w:val="21"/>
+                <w:szCs w:val="21"/>
+              </w:rPr>
+              <w:t xml:space="preserve">اقلام سریال‌دار و انقضادار</w:t>
+            </w:r>
+          </w:p>
+        </w:tc>
+        <w:tc>
+          <w:tcPr>
+            <w:tcW w:type="dxa" w:w="6460"/>
+            <w:shd w:fill="F5F9FB" w:color="auto" w:val="clear"/>
+            <w:tcMar>
+              <w:top w:type="dxa" w:w="80"/>
+              <w:left w:type="dxa" w:w="90"/>
+              <w:bottom w:type="dxa" w:w="80"/>
+              <w:right w:type="dxa" w:w="90"/>
+            </w:tcMar>
+            <w:vAlign w:val="center"/>
+          </w:tcPr>
+          <w:p>
+            <w:pPr>
+              <w:bidi/>
+              <w:spacing w:after="0" w:line="280"/>
+              <w:jc w:val="right"/>
+            </w:pPr>
+            <w:r>
+              <w:rPr>
+                <w:rFonts w:ascii="Tahoma" w:cs="Tahoma" w:eastAsia="Tahoma" w:hAnsi="Tahoma"/>
+                <w:b w:val="false"/>
+                <w:bCs w:val="false"/>
+                <w:color w:val="1A1A1A"/>
+                <w:sz w:val="21"/>
+                <w:szCs w:val="21"/>
+              </w:rPr>
+              <w:t xml:space="preserve">پیروتکنیک، جیره و داروی لایف‌رفت با سریال و تاریخ انقضا، ردیابی ویژه می‌خواهند.</w:t>
+            </w:r>
+          </w:p>
+        </w:tc>
+      </w:tr>
+      <w:tr>
+        <w:tc>
+          <w:tcPr>
+            <w:tcW w:type="dxa" w:w="2900"/>
+            <w:shd w:fill="FFFFFF" w:color="auto" w:val="clear"/>
+            <w:tcMar>
+              <w:top w:type="dxa" w:w="80"/>
+              <w:left w:type="dxa" w:w="90"/>
+              <w:bottom w:type="dxa" w:w="80"/>
+              <w:right w:type="dxa" w:w="90"/>
+            </w:tcMar>
+            <w:vAlign w:val="center"/>
+          </w:tcPr>
+          <w:p>
+            <w:pPr>
+              <w:bidi/>
+              <w:spacing w:after="0" w:line="280"/>
+              <w:jc w:val="right"/>
+            </w:pPr>
+            <w:r>
+              <w:rPr>
+                <w:rFonts w:ascii="Tahoma" w:cs="Tahoma" w:eastAsia="Tahoma" w:hAnsi="Tahoma"/>
+                <w:b/>
+                <w:bCs/>
+                <w:color w:val="1A1A1A"/>
+                <w:sz w:val="21"/>
+                <w:szCs w:val="21"/>
+              </w:rPr>
+              <w:t xml:space="preserve">۹ خط سرویس با منطق متفاوت</w:t>
+            </w:r>
+          </w:p>
+        </w:tc>
+        <w:tc>
+          <w:tcPr>
+            <w:tcW w:type="dxa" w:w="6460"/>
+            <w:shd w:fill="FFFFFF" w:color="auto" w:val="clear"/>
+            <w:tcMar>
+              <w:top w:type="dxa" w:w="80"/>
+              <w:left w:type="dxa" w:w="90"/>
+              <w:bottom w:type="dxa" w:w="80"/>
+              <w:right w:type="dxa" w:w="90"/>
+            </w:tcMar>
+            <w:vAlign w:val="center"/>
+          </w:tcPr>
+          <w:p>
+            <w:pPr>
+              <w:bidi/>
+              <w:spacing w:after="0" w:line="280"/>
+              <w:jc w:val="right"/>
+            </w:pPr>
+            <w:r>
+              <w:rPr>
+                <w:rFonts w:ascii="Tahoma" w:cs="Tahoma" w:eastAsia="Tahoma" w:hAnsi="Tahoma"/>
+                <w:b w:val="false"/>
+                <w:bCs w:val="false"/>
+                <w:color w:val="1A1A1A"/>
+                <w:sz w:val="21"/>
+                <w:szCs w:val="21"/>
+              </w:rPr>
+              <w:t xml:space="preserve">هر خط (LR/LB/FF/ND…) اقلام، چرخه و قواعد مصرف متفاوت دارد.</w:t>
+            </w:r>
+          </w:p>
+        </w:tc>
+      </w:tr>
+      <w:tr>
+        <w:tc>
+          <w:tcPr>
+            <w:tcW w:type="dxa" w:w="2900"/>
+            <w:shd w:fill="F5F9FB" w:color="auto" w:val="clear"/>
+            <w:tcMar>
+              <w:top w:type="dxa" w:w="80"/>
+              <w:left w:type="dxa" w:w="90"/>
+              <w:bottom w:type="dxa" w:w="80"/>
+              <w:right w:type="dxa" w:w="90"/>
+            </w:tcMar>
+            <w:vAlign w:val="center"/>
+          </w:tcPr>
+          <w:p>
+            <w:pPr>
+              <w:bidi/>
+              <w:spacing w:after="0" w:line="280"/>
+              <w:jc w:val="right"/>
+            </w:pPr>
+            <w:r>
+              <w:rPr>
+                <w:rFonts w:ascii="Tahoma" w:cs="Tahoma" w:eastAsia="Tahoma" w:hAnsi="Tahoma"/>
+                <w:b/>
+                <w:bCs/>
+                <w:color w:val="1A1A1A"/>
+                <w:sz w:val="21"/>
+                <w:szCs w:val="21"/>
+              </w:rPr>
+              <w:t xml:space="preserve">وضعیت و تأیید چندمرحله‌ای</w:t>
+            </w:r>
+          </w:p>
+        </w:tc>
+        <w:tc>
+          <w:tcPr>
+            <w:tcW w:type="dxa" w:w="6460"/>
+            <w:shd w:fill="F5F9FB" w:color="auto" w:val="clear"/>
+            <w:tcMar>
+              <w:top w:type="dxa" w:w="80"/>
+              <w:left w:type="dxa" w:w="90"/>
+              <w:bottom w:type="dxa" w:w="80"/>
+              <w:right w:type="dxa" w:w="90"/>
+            </w:tcMar>
+            <w:vAlign w:val="center"/>
+          </w:tcPr>
+          <w:p>
+            <w:pPr>
+              <w:bidi/>
+              <w:spacing w:after="0" w:line="280"/>
+              <w:jc w:val="right"/>
+            </w:pPr>
+            <w:r>
+              <w:rPr>
+                <w:rFonts w:ascii="Tahoma" w:cs="Tahoma" w:eastAsia="Tahoma" w:hAnsi="Tahoma"/>
+                <w:b w:val="false"/>
+                <w:bCs w:val="false"/>
+                <w:color w:val="1A1A1A"/>
+                <w:sz w:val="21"/>
+                <w:szCs w:val="21"/>
+              </w:rPr>
+              <w:t xml:space="preserve">تنخواه و صورت‌حساب چند وضعیت و چند سطح تأیید دارند که باید در تطبیق لحاظ شوند.</w:t>
+            </w:r>
+          </w:p>
+        </w:tc>
+      </w:tr>
+      <w:tr>
+        <w:tc>
+          <w:tcPr>
+            <w:tcW w:type="dxa" w:w="2900"/>
+            <w:shd w:fill="FFFFFF" w:color="auto" w:val="clear"/>
+            <w:tcMar>
+              <w:top w:type="dxa" w:w="80"/>
+              <w:left w:type="dxa" w:w="90"/>
+              <w:bottom w:type="dxa" w:w="80"/>
+              <w:right w:type="dxa" w:w="90"/>
+            </w:tcMar>
+            <w:vAlign w:val="center"/>
+          </w:tcPr>
+          <w:p>
+            <w:pPr>
+              <w:bidi/>
+              <w:spacing w:after="0" w:line="280"/>
+              <w:jc w:val="right"/>
+            </w:pPr>
+            <w:r>
+              <w:rPr>
+                <w:rFonts w:ascii="Tahoma" w:cs="Tahoma" w:eastAsia="Tahoma" w:hAnsi="Tahoma"/>
+                <w:b/>
+                <w:bCs/>
+                <w:color w:val="1A1A1A"/>
+                <w:sz w:val="21"/>
+                <w:szCs w:val="21"/>
+              </w:rPr>
+              <w:t xml:space="preserve">مالیات و سامانه مؤدیان</w:t>
+            </w:r>
+          </w:p>
+        </w:tc>
+        <w:tc>
+          <w:tcPr>
+            <w:tcW w:type="dxa" w:w="6460"/>
+            <w:shd w:fill="FFFFFF" w:color="auto" w:val="clear"/>
+            <w:tcMar>
+              <w:top w:type="dxa" w:w="80"/>
+              <w:left w:type="dxa" w:w="90"/>
+              <w:bottom w:type="dxa" w:w="80"/>
+              <w:right w:type="dxa" w:w="90"/>
+            </w:tcMar>
+            <w:vAlign w:val="center"/>
+          </w:tcPr>
+          <w:p>
+            <w:pPr>
+              <w:bidi/>
+              <w:spacing w:after="0" w:line="280"/>
+              <w:jc w:val="right"/>
+            </w:pPr>
+            <w:r>
+              <w:rPr>
+                <w:rFonts w:ascii="Tahoma" w:cs="Tahoma" w:eastAsia="Tahoma" w:hAnsi="Tahoma"/>
+                <w:b w:val="false"/>
+                <w:bCs w:val="false"/>
+                <w:color w:val="1A1A1A"/>
+                <w:sz w:val="21"/>
+                <w:szCs w:val="21"/>
+              </w:rPr>
+              <w:t xml:space="preserve">صورت‌حساب‌ها باید با اظهار مالیاتی و دفاتر رسمی هم بخوانند.</w:t>
+            </w:r>
+          </w:p>
+        </w:tc>
+      </w:tr>
+    </w:tbl>
     <w:p>
       <w:pPr>
         <w:spacing w:after="120"/>
@@ -4903,7 +5556,7 @@
                 <w:sz w:val="21"/>
                 <w:szCs w:val="21"/>
               </w:rPr>
-              <w:t xml:space="preserve">۲۵٬۰۰۰٬۰۰۰ تومان در هر ماه</w:t>
+              <w:t xml:space="preserve">۳۲٬۵۰۰٬۰۰۰ تومان در هر ماه</w:t>
             </w:r>
           </w:p>
         </w:tc>
@@ -5210,7 +5863,7 @@
                 <w:sz w:val="21"/>
                 <w:szCs w:val="21"/>
               </w:rPr>
-              <w:t xml:space="preserve">۶۵٬۰۰۰٬۰۰۰</w:t>
+              <w:t xml:space="preserve">۸۴٬۵۰۰٬۰۰۰</w:t>
             </w:r>
           </w:p>
         </w:tc>
@@ -5305,7 +5958,7 @@
                 <w:sz w:val="21"/>
                 <w:szCs w:val="21"/>
               </w:rPr>
-              <w:t xml:space="preserve">۱۱۰٬۰۰۰٬۰۰۰</w:t>
+              <w:t xml:space="preserve">۱۴۳٬۰۰۰٬۰۰۰</w:t>
             </w:r>
           </w:p>
         </w:tc>
@@ -5400,7 +6053,7 @@
                 <w:sz w:val="21"/>
                 <w:szCs w:val="21"/>
               </w:rPr>
-              <w:t xml:space="preserve">۹۰٬۰۰۰٬۰۰۰</w:t>
+              <w:t xml:space="preserve">۱۱۷٬۰۰۰٬۰۰۰</w:t>
             </w:r>
           </w:p>
         </w:tc>
@@ -5495,7 +6148,7 @@
                 <w:sz w:val="21"/>
                 <w:szCs w:val="21"/>
               </w:rPr>
-              <w:t xml:space="preserve">۲۶۵٬۰۰۰٬۰۰۰</w:t>
+              <w:t xml:space="preserve">۳۴۴٬۵۰۰٬۰۰۰</w:t>
             </w:r>
           </w:p>
         </w:tc>
@@ -5590,7 +6243,7 @@
                 <w:sz w:val="21"/>
                 <w:szCs w:val="21"/>
               </w:rPr>
-              <w:t xml:space="preserve">۲۵٬۰۰۰٬۰۰۰</w:t>
+              <w:t xml:space="preserve">۳۲٬۵۰۰٬۰۰۰</w:t>
             </w:r>
           </w:p>
         </w:tc>
@@ -5621,7 +6274,7 @@
           <w:sz w:val="20"/>
           <w:szCs w:val="20"/>
         </w:rPr>
-        <w:t xml:space="preserve">پرداخت مبلغ هر فاز متناسب با تحویل همان فاز انجام می‌شود؛ مبلغ کل قرارداد اجرا ۲۶۵ میلیون تومان است.</w:t>
+        <w:t xml:space="preserve">پرداخت مبلغ هر فاز متناسب با تحویل همان فاز انجام می‌شود؛ مبلغ کل قرارداد اجرا ۳۴۴٫۵ میلیون تومان است.</w:t>
       </w:r>
     </w:p>
     <w:p>
@@ -5936,6 +6589,26 @@
       <w:r>
         <w:rPr>
           <w:rFonts w:ascii="Tahoma" w:cs="Tahoma" w:eastAsia="Tahoma" w:hAnsi="Tahoma"/>
+          <w:b/>
+          <w:bCs/>
+          <w:i w:val="false"/>
+          <w:iCs w:val="false"/>
+          <w:color w:val="0B2E4F"/>
+          <w:sz w:val="22"/>
+          <w:szCs w:val="22"/>
+        </w:rPr>
+        <w:t xml:space="preserve">شرکت فناوران فرایند فردا</w:t>
+      </w:r>
+    </w:p>
+    <w:p>
+      <w:pPr>
+        <w:bidi/>
+        <w:spacing w:after="120" w:before="0" w:line="300"/>
+        <w:jc w:val="right"/>
+      </w:pPr>
+      <w:r>
+        <w:rPr>
+          <w:rFonts w:ascii="Tahoma" w:cs="Tahoma" w:eastAsia="Tahoma" w:hAnsi="Tahoma"/>
           <w:b w:val="false"/>
           <w:bCs w:val="false"/>
           <w:i w:val="false"/>
@@ -5944,7 +6617,7 @@
           <w:sz w:val="22"/>
           <w:szCs w:val="22"/>
         </w:rPr>
-        <w:t xml:space="preserve">[نام و امضای شرکت مجری]</w:t>
+        <w:t xml:space="preserve">[محل درج لوگو، مهر و امضای مجاز]</w:t>
       </w:r>
     </w:p>
     <w:sectPr>

</xml_diff>

<commit_message>
Replace paid ongoing support with one month of free post-delivery support
Drop the monthly paid support offering and its fee everywhere; the
proposal now includes up to one month of free support after phase-three
delivery, across HTML and Word.

Co-Authored-By: Claude Opus 4.8 <noreply@anthropic.com>
Claude-Session: https://claude.ai/code/session_01MPAxuqCqMDFFvD4hFtwauN
</commit_message>
<xml_diff>
--- a/proposal/proposal.docx
+++ b/proposal/proposal.docx
@@ -525,7 +525,7 @@
           <w:sz w:val="22"/>
           <w:szCs w:val="22"/>
         </w:rPr>
-        <w:t xml:space="preserve">این پروژه در سه فاز و مجموعاً ۴۵ روز اجرا می‌شود و پس از استقرار، پشتیبانی و توسعهٔ نامحدودِ نیازهای شفاف‌سازی به‌صورت ماهیانه ارائه می‌گردد.</w:t>
+        <w:t xml:space="preserve">این پروژه در سه فاز و مجموعاً ۴۵ روز اجرا می‌شود و پس از تحویل، تا یک ماه پشتیبانی رایگان ارائه می‌گردد.</w:t>
       </w:r>
     </w:p>
     <w:p>
@@ -777,7 +777,7 @@
                 <w:sz w:val="21"/>
                 <w:szCs w:val="21"/>
               </w:rPr>
-              <w:t xml:space="preserve">پشتیبانی و توسعهٔ نامحدود</w:t>
+              <w:t xml:space="preserve">پشتیبانی پس از تحویل</w:t>
             </w:r>
           </w:p>
         </w:tc>
@@ -808,7 +808,7 @@
                 <w:sz w:val="21"/>
                 <w:szCs w:val="21"/>
               </w:rPr>
-              <w:t xml:space="preserve">۳۲٬۵۰۰٬۰۰۰ تومان در ماه</w:t>
+              <w:t xml:space="preserve">تا یک ماه رایگان</w:t>
             </w:r>
           </w:p>
         </w:tc>
@@ -4572,7 +4572,7 @@
                 <w:sz w:val="21"/>
                 <w:szCs w:val="21"/>
               </w:rPr>
-              <w:t xml:space="preserve">مستمر</w:t>
+              <w:t xml:space="preserve">پشتیبانی</w:t>
             </w:r>
           </w:p>
         </w:tc>
@@ -4603,7 +4603,7 @@
                 <w:sz w:val="21"/>
                 <w:szCs w:val="21"/>
               </w:rPr>
-              <w:t xml:space="preserve">پشتیبانی و توسعهٔ نامحدود نیازهای شفاف‌سازی (ماهیانه)</w:t>
+              <w:t xml:space="preserve">تا یک ماه پشتیبانی رایگان پس از تحویل فاز سوم</w:t>
             </w:r>
           </w:p>
         </w:tc>
@@ -5317,7 +5317,7 @@
           <w:sz w:val="30"/>
           <w:szCs w:val="30"/>
         </w:rPr>
-        <w:t xml:space="preserve">۸. پشتیبانی و توسعهٔ مستمر</w:t>
+        <w:t xml:space="preserve">۸. پشتیبانی</w:t>
       </w:r>
     </w:p>
     <w:p>
@@ -5337,7 +5337,7 @@
           <w:sz w:val="22"/>
           <w:szCs w:val="22"/>
         </w:rPr>
-        <w:t xml:space="preserve">پس از اتمام سه فاز اجرا، هر درخواست جدید کارفرما در حوزهٔ شفاف‌سازی — از افزودن داشبورد و گزارش تازه تا تعریف قواعد مغایرت‌گیری جدید و پشتیبانی سامانه — به‌صورت نامحدود ارائه می‌شود.</w:t>
+        <w:t xml:space="preserve">پس از تحویل فاز سوم، تا یک ماه پشتیبانیِ رایگان ارائه می‌شود تا بهره‌برداری اولیه به‌درستی انجام گیرد.</w:t>
       </w:r>
     </w:p>
     <w:p>
@@ -5492,7 +5492,7 @@
                 <w:sz w:val="21"/>
                 <w:szCs w:val="21"/>
               </w:rPr>
-              <w:t xml:space="preserve">پشتیبانی و توسعهٔ نامحدود نیازهای شفاف‌سازی</w:t>
+              <w:t xml:space="preserve">پشتیبانی رایگان پس از تحویل</w:t>
             </w:r>
           </w:p>
         </w:tc>
@@ -5525,7 +5525,7 @@
                 <w:sz w:val="21"/>
                 <w:szCs w:val="21"/>
               </w:rPr>
-              <w:t xml:space="preserve">مبلغ</w:t>
+              <w:t xml:space="preserve">مدت</w:t>
             </w:r>
           </w:p>
         </w:tc>
@@ -5556,7 +5556,7 @@
                 <w:sz w:val="21"/>
                 <w:szCs w:val="21"/>
               </w:rPr>
-              <w:t xml:space="preserve">۳۲٬۵۰۰٬۰۰۰ تومان در هر ماه</w:t>
+              <w:t xml:space="preserve">تا یک ماه پس از تحویل فاز سوم — رایگان</w:t>
             </w:r>
           </w:p>
         </w:tc>
@@ -5620,7 +5620,7 @@
                 <w:sz w:val="21"/>
                 <w:szCs w:val="21"/>
               </w:rPr>
-              <w:t xml:space="preserve">افزودن گزارش/داشبورد، قواعد مغایرت‌گیری جدید، رفع اشکال، به‌روزرسانی و پشتیبانی فنی</w:t>
+              <w:t xml:space="preserve">رفع اشکال، تنظیم و اصلاح داشبوردها، پاسخ‌گویی فنی و همراهی در بهره‌برداری اولیه</w:t>
             </w:r>
           </w:p>
         </w:tc>
@@ -6212,7 +6212,7 @@
                 <w:sz w:val="21"/>
                 <w:szCs w:val="21"/>
               </w:rPr>
-              <w:t xml:space="preserve">پشتیبانی و توسعهٔ نامحدود (ماهیانه)</w:t>
+              <w:t xml:space="preserve">پشتیبانی تا یک ماه پس از تحویل</w:t>
             </w:r>
           </w:p>
         </w:tc>
@@ -6243,7 +6243,7 @@
                 <w:sz w:val="21"/>
                 <w:szCs w:val="21"/>
               </w:rPr>
-              <w:t xml:space="preserve">۳۲٬۵۰۰٬۰۰۰</w:t>
+              <w:t xml:space="preserve">رایگان</w:t>
             </w:r>
           </w:p>
         </w:tc>
@@ -6370,7 +6370,7 @@
           <w:sz w:val="22"/>
           <w:szCs w:val="22"/>
         </w:rPr>
-        <w:t xml:space="preserve">هزینهٔ پشتیبانی ماهیانه از ماه پس از تحویل فاز سوم آغاز می‌شود.</w:t>
+        <w:t xml:space="preserve">تا یک ماه پس از تحویل فاز سوم، پشتیبانی به‌صورت رایگان ارائه می‌شود.</w:t>
       </w:r>
     </w:p>
     <w:p>

</xml_diff>

<commit_message>
Expand the pain section with other unanswered management questions
The quoted pain was only an example; add a set of concrete pains framed
as questions management cannot answer while the three systems stay
separate (real profit per work order, true stock, per-branch P&L,
uncollected invoices, imprest allocation, expiry/serial tracking,
overdue receivables, conflicting reports). Mirrored in HTML and Word.

Co-Authored-By: Claude Opus 4.8 <noreply@anthropic.com>
Claude-Session: https://claude.ai/code/session_01MPAxuqCqMDFFvD4hFtwauN
</commit_message>
<xml_diff>
--- a/proposal/proposal.docx
+++ b/proposal/proposal.docx
@@ -2255,7 +2255,641 @@
           <w:sz w:val="22"/>
           <w:szCs w:val="22"/>
         </w:rPr>
-        <w:t xml:space="preserve">این پروپوزال دقیقاً همین سؤال را به یک پاسخ عددی، خودکار و لحظه‌ای تبدیل می‌کند.</w:t>
+        <w:t xml:space="preserve">این تنها یک نمونه است. وقتی سه سامانه جدا هستند، مدیریت به ساده‌ترین پرسش‌ها هم پاسخ قطعی ندارد — هر پرسش، پاسخش در یک سامانهٔ دیگر است:</w:t>
+      </w:r>
+    </w:p>
+    <w:p>
+      <w:pPr>
+        <w:spacing w:after="40"/>
+      </w:pPr>
+      <w:r>
+        <w:t xml:space="preserve"/>
+      </w:r>
+    </w:p>
+    <w:tbl>
+      <w:tblPr>
+        <w:bidiVisual/>
+        <w:tblW w:type="dxa" w:w="9360"/>
+        <w:tblBorders>
+          <w:top w:val="single" w:color="CFE0E7" w:sz="4"/>
+          <w:left w:val="single" w:color="CFE0E7" w:sz="4"/>
+          <w:bottom w:val="single" w:color="CFE0E7" w:sz="4"/>
+          <w:right w:val="single" w:color="CFE0E7" w:sz="4"/>
+          <w:insideH w:val="single" w:color="CFE0E7" w:sz="4"/>
+          <w:insideV w:val="single" w:color="CFE0E7" w:sz="4"/>
+        </w:tblBorders>
+        <w:tblLayout w:type="fixed"/>
+      </w:tblPr>
+      <w:tblGrid>
+        <w:gridCol w:w="3900"/>
+        <w:gridCol w:w="5460"/>
+      </w:tblGrid>
+      <w:tr>
+        <w:trPr>
+          <w:tblHeader/>
+        </w:trPr>
+        <w:tc>
+          <w:tcPr>
+            <w:tcW w:type="dxa" w:w="3900"/>
+            <w:shd w:fill="0B2E4F" w:color="auto" w:val="clear"/>
+            <w:tcMar>
+              <w:top w:type="dxa" w:w="80"/>
+              <w:left w:type="dxa" w:w="90"/>
+              <w:bottom w:type="dxa" w:w="80"/>
+              <w:right w:type="dxa" w:w="90"/>
+            </w:tcMar>
+            <w:vAlign w:val="center"/>
+          </w:tcPr>
+          <w:p>
+            <w:pPr>
+              <w:bidi/>
+              <w:spacing w:after="0" w:line="280"/>
+              <w:jc w:val="center"/>
+            </w:pPr>
+            <w:r>
+              <w:rPr>
+                <w:rFonts w:ascii="Tahoma" w:cs="Tahoma" w:eastAsia="Tahoma" w:hAnsi="Tahoma"/>
+                <w:b/>
+                <w:bCs/>
+                <w:color w:val="FFFFFF"/>
+                <w:sz w:val="21"/>
+                <w:szCs w:val="21"/>
+              </w:rPr>
+              <w:t xml:space="preserve">پرسشِ بی‌پاسخِ مدیریت</w:t>
+            </w:r>
+          </w:p>
+        </w:tc>
+        <w:tc>
+          <w:tcPr>
+            <w:tcW w:type="dxa" w:w="5460"/>
+            <w:shd w:fill="0B2E4F" w:color="auto" w:val="clear"/>
+            <w:tcMar>
+              <w:top w:type="dxa" w:w="80"/>
+              <w:left w:type="dxa" w:w="90"/>
+              <w:bottom w:type="dxa" w:w="80"/>
+              <w:right w:type="dxa" w:w="90"/>
+            </w:tcMar>
+            <w:vAlign w:val="center"/>
+          </w:tcPr>
+          <w:p>
+            <w:pPr>
+              <w:bidi/>
+              <w:spacing w:after="0" w:line="280"/>
+              <w:jc w:val="center"/>
+            </w:pPr>
+            <w:r>
+              <w:rPr>
+                <w:rFonts w:ascii="Tahoma" w:cs="Tahoma" w:eastAsia="Tahoma" w:hAnsi="Tahoma"/>
+                <w:b/>
+                <w:bCs/>
+                <w:color w:val="FFFFFF"/>
+                <w:sz w:val="21"/>
+                <w:szCs w:val="21"/>
+              </w:rPr>
+              <w:t xml:space="preserve">چرا امروز بی‌پاسخ است</w:t>
+            </w:r>
+          </w:p>
+        </w:tc>
+      </w:tr>
+      <w:tr>
+        <w:tc>
+          <w:tcPr>
+            <w:tcW w:type="dxa" w:w="3900"/>
+            <w:shd w:fill="F5F9FB" w:color="auto" w:val="clear"/>
+            <w:tcMar>
+              <w:top w:type="dxa" w:w="80"/>
+              <w:left w:type="dxa" w:w="90"/>
+              <w:bottom w:type="dxa" w:w="80"/>
+              <w:right w:type="dxa" w:w="90"/>
+            </w:tcMar>
+            <w:vAlign w:val="center"/>
+          </w:tcPr>
+          <w:p>
+            <w:pPr>
+              <w:bidi/>
+              <w:spacing w:after="0" w:line="280"/>
+              <w:jc w:val="right"/>
+            </w:pPr>
+            <w:r>
+              <w:rPr>
+                <w:rFonts w:ascii="Tahoma" w:cs="Tahoma" w:eastAsia="Tahoma" w:hAnsi="Tahoma"/>
+                <w:b/>
+                <w:bCs/>
+                <w:color w:val="1A1A1A"/>
+                <w:sz w:val="21"/>
+                <w:szCs w:val="21"/>
+              </w:rPr>
+              <w:t xml:space="preserve">سود واقعیِ هر دستور کار چقدر است؟</w:t>
+            </w:r>
+          </w:p>
+        </w:tc>
+        <w:tc>
+          <w:tcPr>
+            <w:tcW w:type="dxa" w:w="5460"/>
+            <w:shd w:fill="F5F9FB" w:color="auto" w:val="clear"/>
+            <w:tcMar>
+              <w:top w:type="dxa" w:w="80"/>
+              <w:left w:type="dxa" w:w="90"/>
+              <w:bottom w:type="dxa" w:w="80"/>
+              <w:right w:type="dxa" w:w="90"/>
+            </w:tcMar>
+            <w:vAlign w:val="center"/>
+          </w:tcPr>
+          <w:p>
+            <w:pPr>
+              <w:bidi/>
+              <w:spacing w:after="0" w:line="280"/>
+              <w:jc w:val="right"/>
+            </w:pPr>
+            <w:r>
+              <w:rPr>
+                <w:rFonts w:ascii="Tahoma" w:cs="Tahoma" w:eastAsia="Tahoma" w:hAnsi="Tahoma"/>
+                <w:b w:val="false"/>
+                <w:bCs w:val="false"/>
+                <w:color w:val="1A1A1A"/>
+                <w:sz w:val="21"/>
+                <w:szCs w:val="21"/>
+              </w:rPr>
+              <w:t xml:space="preserve">درآمد در صورت‌حساب، هزینه در تنخواه و انبار پخش است؛ کنار هم نمی‌آید.</w:t>
+            </w:r>
+          </w:p>
+        </w:tc>
+      </w:tr>
+      <w:tr>
+        <w:tc>
+          <w:tcPr>
+            <w:tcW w:type="dxa" w:w="3900"/>
+            <w:shd w:fill="FFFFFF" w:color="auto" w:val="clear"/>
+            <w:tcMar>
+              <w:top w:type="dxa" w:w="80"/>
+              <w:left w:type="dxa" w:w="90"/>
+              <w:bottom w:type="dxa" w:w="80"/>
+              <w:right w:type="dxa" w:w="90"/>
+            </w:tcMar>
+            <w:vAlign w:val="center"/>
+          </w:tcPr>
+          <w:p>
+            <w:pPr>
+              <w:bidi/>
+              <w:spacing w:after="0" w:line="280"/>
+              <w:jc w:val="right"/>
+            </w:pPr>
+            <w:r>
+              <w:rPr>
+                <w:rFonts w:ascii="Tahoma" w:cs="Tahoma" w:eastAsia="Tahoma" w:hAnsi="Tahoma"/>
+                <w:b/>
+                <w:bCs/>
+                <w:color w:val="1A1A1A"/>
+                <w:sz w:val="21"/>
+                <w:szCs w:val="21"/>
+              </w:rPr>
+              <w:t xml:space="preserve">موجودی واقعیِ انبار چقدر است و چقدرش کسری/پرت دارد؟</w:t>
+            </w:r>
+          </w:p>
+        </w:tc>
+        <w:tc>
+          <w:tcPr>
+            <w:tcW w:type="dxa" w:w="5460"/>
+            <w:shd w:fill="FFFFFF" w:color="auto" w:val="clear"/>
+            <w:tcMar>
+              <w:top w:type="dxa" w:w="80"/>
+              <w:left w:type="dxa" w:w="90"/>
+              <w:bottom w:type="dxa" w:w="80"/>
+              <w:right w:type="dxa" w:w="90"/>
+            </w:tcMar>
+            <w:vAlign w:val="center"/>
+          </w:tcPr>
+          <w:p>
+            <w:pPr>
+              <w:bidi/>
+              <w:spacing w:after="0" w:line="280"/>
+              <w:jc w:val="right"/>
+            </w:pPr>
+            <w:r>
+              <w:rPr>
+                <w:rFonts w:ascii="Tahoma" w:cs="Tahoma" w:eastAsia="Tahoma" w:hAnsi="Tahoma"/>
+                <w:b w:val="false"/>
+                <w:bCs w:val="false"/>
+                <w:color w:val="1A1A1A"/>
+                <w:sz w:val="21"/>
+                <w:szCs w:val="21"/>
+              </w:rPr>
+              <w:t xml:space="preserve">مصرفِ عملیات با کسرِ انبار تطبیق داده نمی‌شود.</w:t>
+            </w:r>
+          </w:p>
+        </w:tc>
+      </w:tr>
+      <w:tr>
+        <w:tc>
+          <w:tcPr>
+            <w:tcW w:type="dxa" w:w="3900"/>
+            <w:shd w:fill="F5F9FB" w:color="auto" w:val="clear"/>
+            <w:tcMar>
+              <w:top w:type="dxa" w:w="80"/>
+              <w:left w:type="dxa" w:w="90"/>
+              <w:bottom w:type="dxa" w:w="80"/>
+              <w:right w:type="dxa" w:w="90"/>
+            </w:tcMar>
+            <w:vAlign w:val="center"/>
+          </w:tcPr>
+          <w:p>
+            <w:pPr>
+              <w:bidi/>
+              <w:spacing w:after="0" w:line="280"/>
+              <w:jc w:val="right"/>
+            </w:pPr>
+            <w:r>
+              <w:rPr>
+                <w:rFonts w:ascii="Tahoma" w:cs="Tahoma" w:eastAsia="Tahoma" w:hAnsi="Tahoma"/>
+                <w:b/>
+                <w:bCs/>
+                <w:color w:val="1A1A1A"/>
+                <w:sz w:val="21"/>
+                <w:szCs w:val="21"/>
+              </w:rPr>
+              <w:t xml:space="preserve">کدام شعبه سودده است و کدام زیان‌ده؟</w:t>
+            </w:r>
+          </w:p>
+        </w:tc>
+        <w:tc>
+          <w:tcPr>
+            <w:tcW w:type="dxa" w:w="5460"/>
+            <w:shd w:fill="F5F9FB" w:color="auto" w:val="clear"/>
+            <w:tcMar>
+              <w:top w:type="dxa" w:w="80"/>
+              <w:left w:type="dxa" w:w="90"/>
+              <w:bottom w:type="dxa" w:w="80"/>
+              <w:right w:type="dxa" w:w="90"/>
+            </w:tcMar>
+            <w:vAlign w:val="center"/>
+          </w:tcPr>
+          <w:p>
+            <w:pPr>
+              <w:bidi/>
+              <w:spacing w:after="0" w:line="280"/>
+              <w:jc w:val="right"/>
+            </w:pPr>
+            <w:r>
+              <w:rPr>
+                <w:rFonts w:ascii="Tahoma" w:cs="Tahoma" w:eastAsia="Tahoma" w:hAnsi="Tahoma"/>
+                <w:b w:val="false"/>
+                <w:bCs w:val="false"/>
+                <w:color w:val="1A1A1A"/>
+                <w:sz w:val="21"/>
+                <w:szCs w:val="21"/>
+              </w:rPr>
+              <w:t xml:space="preserve">عملکرد شعب روی یک معیارِ مشترک مقایسه نمی‌شود.</w:t>
+            </w:r>
+          </w:p>
+        </w:tc>
+      </w:tr>
+      <w:tr>
+        <w:tc>
+          <w:tcPr>
+            <w:tcW w:type="dxa" w:w="3900"/>
+            <w:shd w:fill="FFFFFF" w:color="auto" w:val="clear"/>
+            <w:tcMar>
+              <w:top w:type="dxa" w:w="80"/>
+              <w:left w:type="dxa" w:w="90"/>
+              <w:bottom w:type="dxa" w:w="80"/>
+              <w:right w:type="dxa" w:w="90"/>
+            </w:tcMar>
+            <w:vAlign w:val="center"/>
+          </w:tcPr>
+          <w:p>
+            <w:pPr>
+              <w:bidi/>
+              <w:spacing w:after="0" w:line="280"/>
+              <w:jc w:val="right"/>
+            </w:pPr>
+            <w:r>
+              <w:rPr>
+                <w:rFonts w:ascii="Tahoma" w:cs="Tahoma" w:eastAsia="Tahoma" w:hAnsi="Tahoma"/>
+                <w:b/>
+                <w:bCs/>
+                <w:color w:val="1A1A1A"/>
+                <w:sz w:val="21"/>
+                <w:szCs w:val="21"/>
+              </w:rPr>
+              <w:t xml:space="preserve">آیا همهٔ صورت‌حساب‌های صادره ثبت و وصول شده‌اند؟</w:t>
+            </w:r>
+          </w:p>
+        </w:tc>
+        <w:tc>
+          <w:tcPr>
+            <w:tcW w:type="dxa" w:w="5460"/>
+            <w:shd w:fill="FFFFFF" w:color="auto" w:val="clear"/>
+            <w:tcMar>
+              <w:top w:type="dxa" w:w="80"/>
+              <w:left w:type="dxa" w:w="90"/>
+              <w:bottom w:type="dxa" w:w="80"/>
+              <w:right w:type="dxa" w:w="90"/>
+            </w:tcMar>
+            <w:vAlign w:val="center"/>
+          </w:tcPr>
+          <w:p>
+            <w:pPr>
+              <w:bidi/>
+              <w:spacing w:after="0" w:line="280"/>
+              <w:jc w:val="right"/>
+            </w:pPr>
+            <w:r>
+              <w:rPr>
+                <w:rFonts w:ascii="Tahoma" w:cs="Tahoma" w:eastAsia="Tahoma" w:hAnsi="Tahoma"/>
+                <w:b w:val="false"/>
+                <w:bCs w:val="false"/>
+                <w:color w:val="1A1A1A"/>
+                <w:sz w:val="21"/>
+                <w:szCs w:val="21"/>
+              </w:rPr>
+              <w:t xml:space="preserve">صورت‌حساب در عملیات و سند در حسابداری است؛ جامانده‌ها پیدا نمی‌شوند.</w:t>
+            </w:r>
+          </w:p>
+        </w:tc>
+      </w:tr>
+      <w:tr>
+        <w:tc>
+          <w:tcPr>
+            <w:tcW w:type="dxa" w:w="3900"/>
+            <w:shd w:fill="F5F9FB" w:color="auto" w:val="clear"/>
+            <w:tcMar>
+              <w:top w:type="dxa" w:w="80"/>
+              <w:left w:type="dxa" w:w="90"/>
+              <w:bottom w:type="dxa" w:w="80"/>
+              <w:right w:type="dxa" w:w="90"/>
+            </w:tcMar>
+            <w:vAlign w:val="center"/>
+          </w:tcPr>
+          <w:p>
+            <w:pPr>
+              <w:bidi/>
+              <w:spacing w:after="0" w:line="280"/>
+              <w:jc w:val="right"/>
+            </w:pPr>
+            <w:r>
+              <w:rPr>
+                <w:rFonts w:ascii="Tahoma" w:cs="Tahoma" w:eastAsia="Tahoma" w:hAnsi="Tahoma"/>
+                <w:b/>
+                <w:bCs/>
+                <w:color w:val="1A1A1A"/>
+                <w:sz w:val="21"/>
+                <w:szCs w:val="21"/>
+              </w:rPr>
+              <w:t xml:space="preserve">هزینهٔ هر تنخواه به کدام دستور کار خورده است؟</w:t>
+            </w:r>
+          </w:p>
+        </w:tc>
+        <w:tc>
+          <w:tcPr>
+            <w:tcW w:type="dxa" w:w="5460"/>
+            <w:shd w:fill="F5F9FB" w:color="auto" w:val="clear"/>
+            <w:tcMar>
+              <w:top w:type="dxa" w:w="80"/>
+              <w:left w:type="dxa" w:w="90"/>
+              <w:bottom w:type="dxa" w:w="80"/>
+              <w:right w:type="dxa" w:w="90"/>
+            </w:tcMar>
+            <w:vAlign w:val="center"/>
+          </w:tcPr>
+          <w:p>
+            <w:pPr>
+              <w:bidi/>
+              <w:spacing w:after="0" w:line="280"/>
+              <w:jc w:val="right"/>
+            </w:pPr>
+            <w:r>
+              <w:rPr>
+                <w:rFonts w:ascii="Tahoma" w:cs="Tahoma" w:eastAsia="Tahoma" w:hAnsi="Tahoma"/>
+                <w:b w:val="false"/>
+                <w:bCs w:val="false"/>
+                <w:color w:val="1A1A1A"/>
+                <w:sz w:val="21"/>
+                <w:szCs w:val="21"/>
+              </w:rPr>
+              <w:t xml:space="preserve">تخصیصِ هزینه به عملیات مبهم است و بهای تمام‌شده اشتباه می‌شود.</w:t>
+            </w:r>
+          </w:p>
+        </w:tc>
+      </w:tr>
+      <w:tr>
+        <w:tc>
+          <w:tcPr>
+            <w:tcW w:type="dxa" w:w="3900"/>
+            <w:shd w:fill="FFFFFF" w:color="auto" w:val="clear"/>
+            <w:tcMar>
+              <w:top w:type="dxa" w:w="80"/>
+              <w:left w:type="dxa" w:w="90"/>
+              <w:bottom w:type="dxa" w:w="80"/>
+              <w:right w:type="dxa" w:w="90"/>
+            </w:tcMar>
+            <w:vAlign w:val="center"/>
+          </w:tcPr>
+          <w:p>
+            <w:pPr>
+              <w:bidi/>
+              <w:spacing w:after="0" w:line="280"/>
+              <w:jc w:val="right"/>
+            </w:pPr>
+            <w:r>
+              <w:rPr>
+                <w:rFonts w:ascii="Tahoma" w:cs="Tahoma" w:eastAsia="Tahoma" w:hAnsi="Tahoma"/>
+                <w:b/>
+                <w:bCs/>
+                <w:color w:val="1A1A1A"/>
+                <w:sz w:val="21"/>
+                <w:szCs w:val="21"/>
+              </w:rPr>
+              <w:t xml:space="preserve">چند قلمِ انقضادار/سریال‌دار داریم و کجا مصرف شده؟</w:t>
+            </w:r>
+          </w:p>
+        </w:tc>
+        <w:tc>
+          <w:tcPr>
+            <w:tcW w:type="dxa" w:w="5460"/>
+            <w:shd w:fill="FFFFFF" w:color="auto" w:val="clear"/>
+            <w:tcMar>
+              <w:top w:type="dxa" w:w="80"/>
+              <w:left w:type="dxa" w:w="90"/>
+              <w:bottom w:type="dxa" w:w="80"/>
+              <w:right w:type="dxa" w:w="90"/>
+            </w:tcMar>
+            <w:vAlign w:val="center"/>
+          </w:tcPr>
+          <w:p>
+            <w:pPr>
+              <w:bidi/>
+              <w:spacing w:after="0" w:line="280"/>
+              <w:jc w:val="right"/>
+            </w:pPr>
+            <w:r>
+              <w:rPr>
+                <w:rFonts w:ascii="Tahoma" w:cs="Tahoma" w:eastAsia="Tahoma" w:hAnsi="Tahoma"/>
+                <w:b w:val="false"/>
+                <w:bCs w:val="false"/>
+                <w:color w:val="1A1A1A"/>
+                <w:sz w:val="21"/>
+                <w:szCs w:val="21"/>
+              </w:rPr>
+              <w:t xml:space="preserve">ردیابیِ اقلام حیاتی بین عملیات و انبار وجود ندارد.</w:t>
+            </w:r>
+          </w:p>
+        </w:tc>
+      </w:tr>
+      <w:tr>
+        <w:tc>
+          <w:tcPr>
+            <w:tcW w:type="dxa" w:w="3900"/>
+            <w:shd w:fill="F5F9FB" w:color="auto" w:val="clear"/>
+            <w:tcMar>
+              <w:top w:type="dxa" w:w="80"/>
+              <w:left w:type="dxa" w:w="90"/>
+              <w:bottom w:type="dxa" w:w="80"/>
+              <w:right w:type="dxa" w:w="90"/>
+            </w:tcMar>
+            <w:vAlign w:val="center"/>
+          </w:tcPr>
+          <w:p>
+            <w:pPr>
+              <w:bidi/>
+              <w:spacing w:after="0" w:line="280"/>
+              <w:jc w:val="right"/>
+            </w:pPr>
+            <w:r>
+              <w:rPr>
+                <w:rFonts w:ascii="Tahoma" w:cs="Tahoma" w:eastAsia="Tahoma" w:hAnsi="Tahoma"/>
+                <w:b/>
+                <w:bCs/>
+                <w:color w:val="1A1A1A"/>
+                <w:sz w:val="21"/>
+                <w:szCs w:val="21"/>
+              </w:rPr>
+              <w:t xml:space="preserve">مطالبات معوق از مشتریان چقدر است؟</w:t>
+            </w:r>
+          </w:p>
+        </w:tc>
+        <w:tc>
+          <w:tcPr>
+            <w:tcW w:type="dxa" w:w="5460"/>
+            <w:shd w:fill="F5F9FB" w:color="auto" w:val="clear"/>
+            <w:tcMar>
+              <w:top w:type="dxa" w:w="80"/>
+              <w:left w:type="dxa" w:w="90"/>
+              <w:bottom w:type="dxa" w:w="80"/>
+              <w:right w:type="dxa" w:w="90"/>
+            </w:tcMar>
+            <w:vAlign w:val="center"/>
+          </w:tcPr>
+          <w:p>
+            <w:pPr>
+              <w:bidi/>
+              <w:spacing w:after="0" w:line="280"/>
+              <w:jc w:val="right"/>
+            </w:pPr>
+            <w:r>
+              <w:rPr>
+                <w:rFonts w:ascii="Tahoma" w:cs="Tahoma" w:eastAsia="Tahoma" w:hAnsi="Tahoma"/>
+                <w:b w:val="false"/>
+                <w:bCs w:val="false"/>
+                <w:color w:val="1A1A1A"/>
+                <w:sz w:val="21"/>
+                <w:szCs w:val="21"/>
+              </w:rPr>
+              <w:t xml:space="preserve">وضعیت وصول و کسورات بین صورت‌حساب و حسابداری یکپارچه نیست.</w:t>
+            </w:r>
+          </w:p>
+        </w:tc>
+      </w:tr>
+      <w:tr>
+        <w:tc>
+          <w:tcPr>
+            <w:tcW w:type="dxa" w:w="3900"/>
+            <w:shd w:fill="FFFFFF" w:color="auto" w:val="clear"/>
+            <w:tcMar>
+              <w:top w:type="dxa" w:w="80"/>
+              <w:left w:type="dxa" w:w="90"/>
+              <w:bottom w:type="dxa" w:w="80"/>
+              <w:right w:type="dxa" w:w="90"/>
+            </w:tcMar>
+            <w:vAlign w:val="center"/>
+          </w:tcPr>
+          <w:p>
+            <w:pPr>
+              <w:bidi/>
+              <w:spacing w:after="0" w:line="280"/>
+              <w:jc w:val="right"/>
+            </w:pPr>
+            <w:r>
+              <w:rPr>
+                <w:rFonts w:ascii="Tahoma" w:cs="Tahoma" w:eastAsia="Tahoma" w:hAnsi="Tahoma"/>
+                <w:b/>
+                <w:bCs/>
+                <w:color w:val="1A1A1A"/>
+                <w:sz w:val="21"/>
+                <w:szCs w:val="21"/>
+              </w:rPr>
+              <w:t xml:space="preserve">چرا عددِ گزارش عملیات با گزارش مالی فرق دارد؟</w:t>
+            </w:r>
+          </w:p>
+        </w:tc>
+        <w:tc>
+          <w:tcPr>
+            <w:tcW w:type="dxa" w:w="5460"/>
+            <w:shd w:fill="FFFFFF" w:color="auto" w:val="clear"/>
+            <w:tcMar>
+              <w:top w:type="dxa" w:w="80"/>
+              <w:left w:type="dxa" w:w="90"/>
+              <w:bottom w:type="dxa" w:w="80"/>
+              <w:right w:type="dxa" w:w="90"/>
+            </w:tcMar>
+            <w:vAlign w:val="center"/>
+          </w:tcPr>
+          <w:p>
+            <w:pPr>
+              <w:bidi/>
+              <w:spacing w:after="0" w:line="280"/>
+              <w:jc w:val="right"/>
+            </w:pPr>
+            <w:r>
+              <w:rPr>
+                <w:rFonts w:ascii="Tahoma" w:cs="Tahoma" w:eastAsia="Tahoma" w:hAnsi="Tahoma"/>
+                <w:b w:val="false"/>
+                <w:bCs w:val="false"/>
+                <w:color w:val="1A1A1A"/>
+                <w:sz w:val="21"/>
+                <w:szCs w:val="21"/>
+              </w:rPr>
+              <w:t xml:space="preserve">هر سامانه یک «حقیقتِ» متفاوت گزارش می‌کند.</w:t>
+            </w:r>
+          </w:p>
+        </w:tc>
+      </w:tr>
+    </w:tbl>
+    <w:p>
+      <w:pPr>
+        <w:spacing w:after="60"/>
+      </w:pPr>
+      <w:r>
+        <w:t xml:space="preserve"/>
+      </w:r>
+    </w:p>
+    <w:p>
+      <w:pPr>
+        <w:bidi/>
+        <w:spacing w:after="120" w:before="0" w:line="300"/>
+        <w:jc w:val="right"/>
+      </w:pPr>
+      <w:r>
+        <w:rPr>
+          <w:rFonts w:ascii="Tahoma" w:cs="Tahoma" w:eastAsia="Tahoma" w:hAnsi="Tahoma"/>
+          <w:b/>
+          <w:bCs/>
+          <w:i w:val="false"/>
+          <w:iCs w:val="false"/>
+          <w:color w:val="0B2E4F"/>
+          <w:sz w:val="22"/>
+          <w:szCs w:val="22"/>
+        </w:rPr>
+        <w:t xml:space="preserve">این پروپوزال همهٔ این پرسش‌ها را به پاسخ‌های عددی، خودکار و لحظه‌ای تبدیل می‌کند.</w:t>
       </w:r>
     </w:p>
     <w:p>

</xml_diff>

<commit_message>
Trim operations modules, drop phase-1 data-model bullet, remove price from first page
- Operations profile now lists only work orders, customers/contracts,
  invoices, and certificates (drop equipment, cost/imprest, office
  automation, reports).
- Remove the phase-1 data-model bullet entirely.
- Remove the total-amount row from the Word first-page summary (price
  stays in the financial section); hero already carries no price.

Co-Authored-By: Claude Opus 4.8 <noreply@anthropic.com>
Claude-Session: https://claude.ai/code/session_01MPAxuqCqMDFFvD4hFtwauN
</commit_message>
<xml_diff>
--- a/proposal/proposal.docx
+++ b/proposal/proposal.docx
@@ -713,7 +713,7 @@
                 <w:sz w:val="21"/>
                 <w:szCs w:val="21"/>
               </w:rPr>
-              <w:t xml:space="preserve">مبلغ کل قرارداد اجرا</w:t>
+              <w:t xml:space="preserve">پشتیبانی پس از تحویل</w:t>
             </w:r>
           </w:p>
         </w:tc>
@@ -744,7 +744,7 @@
                 <w:sz w:val="21"/>
                 <w:szCs w:val="21"/>
               </w:rPr>
-              <w:t xml:space="preserve">۳۴۴٬۵۰۰٬۰۰۰ تومان</w:t>
+              <w:t xml:space="preserve">تا یک ماه رایگان</w:t>
             </w:r>
           </w:p>
         </w:tc>
@@ -777,7 +777,7 @@
                 <w:sz w:val="21"/>
                 <w:szCs w:val="21"/>
               </w:rPr>
-              <w:t xml:space="preserve">پشتیبانی پس از تحویل</w:t>
+              <w:t xml:space="preserve">خروجی نهایی</w:t>
             </w:r>
           </w:p>
         </w:tc>
@@ -785,70 +785,6 @@
           <w:tcPr>
             <w:tcW w:type="dxa" w:w="5960"/>
             <w:shd w:fill="F5F9FB" w:color="auto" w:val="clear"/>
-            <w:tcMar>
-              <w:top w:type="dxa" w:w="80"/>
-              <w:left w:type="dxa" w:w="90"/>
-              <w:bottom w:type="dxa" w:w="80"/>
-              <w:right w:type="dxa" w:w="90"/>
-            </w:tcMar>
-            <w:vAlign w:val="center"/>
-          </w:tcPr>
-          <w:p>
-            <w:pPr>
-              <w:bidi/>
-              <w:spacing w:after="0" w:line="280"/>
-              <w:jc w:val="right"/>
-            </w:pPr>
-            <w:r>
-              <w:rPr>
-                <w:rFonts w:ascii="Tahoma" w:cs="Tahoma" w:eastAsia="Tahoma" w:hAnsi="Tahoma"/>
-                <w:b w:val="false"/>
-                <w:bCs w:val="false"/>
-                <w:color w:val="1A1A1A"/>
-                <w:sz w:val="21"/>
-                <w:szCs w:val="21"/>
-              </w:rPr>
-              <w:t xml:space="preserve">تا یک ماه رایگان</w:t>
-            </w:r>
-          </w:p>
-        </w:tc>
-      </w:tr>
-      <w:tr>
-        <w:tc>
-          <w:tcPr>
-            <w:tcW w:type="dxa" w:w="3400"/>
-            <w:shd w:fill="FFFFFF" w:color="auto" w:val="clear"/>
-            <w:tcMar>
-              <w:top w:type="dxa" w:w="80"/>
-              <w:left w:type="dxa" w:w="90"/>
-              <w:bottom w:type="dxa" w:w="80"/>
-              <w:right w:type="dxa" w:w="90"/>
-            </w:tcMar>
-            <w:vAlign w:val="center"/>
-          </w:tcPr>
-          <w:p>
-            <w:pPr>
-              <w:bidi/>
-              <w:spacing w:after="0" w:line="280"/>
-              <w:jc w:val="right"/>
-            </w:pPr>
-            <w:r>
-              <w:rPr>
-                <w:rFonts w:ascii="Tahoma" w:cs="Tahoma" w:eastAsia="Tahoma" w:hAnsi="Tahoma"/>
-                <w:b w:val="false"/>
-                <w:bCs w:val="false"/>
-                <w:color w:val="1A1A1A"/>
-                <w:sz w:val="21"/>
-                <w:szCs w:val="21"/>
-              </w:rPr>
-              <w:t xml:space="preserve">خروجی نهایی</w:t>
-            </w:r>
-          </w:p>
-        </w:tc>
-        <w:tc>
-          <w:tcPr>
-            <w:tcW w:type="dxa" w:w="5960"/>
-            <w:shd w:fill="FFFFFF" w:color="auto" w:val="clear"/>
             <w:tcMar>
               <w:top w:type="dxa" w:w="80"/>
               <w:left w:type="dxa" w:w="90"/>
@@ -1109,7 +1045,7 @@
                 <w:sz w:val="21"/>
                 <w:szCs w:val="21"/>
               </w:rPr>
-              <w:t xml:space="preserve">ثبت دستور کار سرویس، تجهیزات، صورت‌حساب و هزینه/تنخواه</w:t>
+              <w:t xml:space="preserve">ثبت دستور کار سرویس، مشتریان/قراردادها، صورت‌حساب و گواهینامه</w:t>
             </w:r>
           </w:p>
         </w:tc>
@@ -1140,7 +1076,7 @@
                 <w:sz w:val="21"/>
                 <w:szCs w:val="21"/>
               </w:rPr>
-              <w:t xml:space="preserve">دستور کار (LR/LB/LS/FF/ND/UT/CI-LT/SE/PR)، اقلام مصرفی، صورت‌حساب، هزینه، شعبه</w:t>
+              <w:t xml:space="preserve">دستور کار (LR/LB/LS/FF/ND/UT/CI-LT/SE/PR)، اقلام مصرفی، صورت‌حساب، شعبه</w:t>
             </w:r>
           </w:p>
         </w:tc>
@@ -3404,29 +3340,6 @@
           <w:szCs w:val="22"/>
         </w:rPr>
         <w:t xml:space="preserve">شناسایی و مستندسازی منابع داده و ساختار هر سه سامانه در تمام شعب.</w:t>
-      </w:r>
-    </w:p>
-    <w:p>
-      <w:pPr>
-        <w:pStyle w:val="ListParagraph"/>
-        <w:numPr>
-          <w:ilvl w:val="0"/>
-          <w:numId w:val="2"/>
-        </w:numPr>
-        <w:bidi/>
-        <w:spacing w:after="70" w:line="290"/>
-        <w:jc w:val="right"/>
-      </w:pPr>
-      <w:r>
-        <w:rPr>
-          <w:rFonts w:ascii="Tahoma" w:cs="Tahoma" w:eastAsia="Tahoma" w:hAnsi="Tahoma"/>
-          <w:b w:val="false"/>
-          <w:bCs w:val="false"/>
-          <w:color w:val="1A1A1A"/>
-          <w:sz w:val="22"/>
-          <w:szCs w:val="22"/>
-        </w:rPr>
-        <w:t xml:space="preserve">طراحی مدل دادهٔ انبار داده متناسب با چرخهٔ کاملِ کسب‌وکار (۹ خط سرویس، انبار و مالی).</w:t>
       </w:r>
     </w:p>
     <w:p>

</xml_diff>

<commit_message>
Add database-decryption phase as new phase one (10 days, 55M)
Prepend a reverse-engineering / decryption phase for the three systems'
databases as phase 1 (prerequisite to ETL); renumber the rest to four
phases totaling 55 days and 399.5M. Timeline gains a fourth segment;
phases now render as a 2x2 grid. Applied to HTML and Word.

Co-Authored-By: Claude Opus 4.8 <noreply@anthropic.com>
Claude-Session: https://claude.ai/code/session_01MPAxuqCqMDFFvD4hFtwauN
</commit_message>
<xml_diff>
--- a/proposal/proposal.docx
+++ b/proposal/proposal.docx
@@ -525,7 +525,7 @@
           <w:sz w:val="22"/>
           <w:szCs w:val="22"/>
         </w:rPr>
-        <w:t xml:space="preserve">این پروژه در سه فاز و مجموعاً ۴۵ روز اجرا می‌شود و پس از تحویل، تا یک ماه پشتیبانی رایگان ارائه می‌گردد.</w:t>
+        <w:t xml:space="preserve">این پروژه در چهار فاز و مجموعاً ۵۵ روز اجرا می‌شود و پس از تحویل، تا یک ماه پشتیبانی رایگان ارائه می‌گردد.</w:t>
       </w:r>
     </w:p>
     <w:p>
@@ -680,7 +680,7 @@
                 <w:sz w:val="21"/>
                 <w:szCs w:val="21"/>
               </w:rPr>
-              <w:t xml:space="preserve">۴۵ روز (فاز ۱: ۱۰ روز، فاز ۲: ۲۰ روز، فاز ۳: ۱۵ روز)</w:t>
+              <w:t xml:space="preserve">۵۵ روز (رمزگشایی ۱۰، انبار داده ۱۰، مایگریشن ۲۰، BI ۱۵ روز)</w:t>
             </w:r>
           </w:p>
         </w:tc>
@@ -3296,7 +3296,7 @@
           <w:sz w:val="25"/>
           <w:szCs w:val="25"/>
         </w:rPr>
-        <w:t xml:space="preserve">فاز اول — ساخت انبار داده (Data Warehouse) | ۱۰ روز</w:t>
+        <w:t xml:space="preserve">فاز اول — رمزگشایی دیتابیس سه نرم‌افزار | ۱۰ روز</w:t>
       </w:r>
     </w:p>
     <w:p>
@@ -3316,7 +3316,7 @@
           <w:sz w:val="22"/>
           <w:szCs w:val="22"/>
         </w:rPr>
-        <w:t xml:space="preserve">در این فاز، دادهٔ سه سامانه از همهٔ شعب استخراج، پاک‌سازی و در یک انبار دادهٔ مرکزی و ساخت‌یافته گردآوری می‌شود تا زیربنای یکپارچه‌سازی فراهم گردد.</w:t>
+        <w:t xml:space="preserve">پیش از هر کاری، ساختار پنهانِ دیتابیس هر سه نرم‌افزار باید باز و مستند شود؛ بدون این نقشه، استخراج داده ممکن نیست.</w:t>
       </w:r>
     </w:p>
     <w:p>
@@ -3339,7 +3339,7 @@
           <w:sz w:val="22"/>
           <w:szCs w:val="22"/>
         </w:rPr>
-        <w:t xml:space="preserve">شناسایی و مستندسازی منابع داده و ساختار هر سه سامانه در تمام شعب.</w:t>
+        <w:t xml:space="preserve">مهندسی معکوس و رمزگشایی ساختار دیتابیس هر سه نرم‌افزار (جداول، روابط، فیلدها).</w:t>
       </w:r>
     </w:p>
     <w:p>
@@ -3362,7 +3362,7 @@
           <w:sz w:val="22"/>
           <w:szCs w:val="22"/>
         </w:rPr>
-        <w:t xml:space="preserve">پیاده‌سازی فرآیند استخراج و بارگذاری داده (ETL) از سه سیستم.</w:t>
+        <w:t xml:space="preserve">شناسایی محل ذخیرهٔ دستور کار، اقلام، صورت‌حساب، اسناد مالی و موجودی.</w:t>
       </w:r>
     </w:p>
     <w:p>
@@ -3385,7 +3385,7 @@
           <w:sz w:val="22"/>
           <w:szCs w:val="22"/>
         </w:rPr>
-        <w:t xml:space="preserve">پاک‌سازی، استانداردسازی و یکدست‌سازی داده‌ها (تاریخ، کد کالا، کد شعبه، مشتری).</w:t>
+        <w:t xml:space="preserve">باز کردن داده‌های رمزنگاری‌شده/کدشده و برقراری دسترسی امن به آن‌ها.</w:t>
       </w:r>
     </w:p>
     <w:p>
@@ -3408,7 +3408,7 @@
           <w:sz w:val="22"/>
           <w:szCs w:val="22"/>
         </w:rPr>
-        <w:t xml:space="preserve">راه‌اندازی انبار دادهٔ مرکزی به‌عنوان منبع واحد حقیقت.</w:t>
+        <w:t xml:space="preserve">تهیهٔ دیکشنری داده و نقشهٔ کاملِ سه دیتابیس.</w:t>
       </w:r>
     </w:p>
     <w:p>
@@ -3437,7 +3437,7 @@
           <w:sz w:val="22"/>
           <w:szCs w:val="22"/>
         </w:rPr>
-        <w:t xml:space="preserve">انبار دادهٔ عملیاتیِ یکپارچه از هر سه سامانه و همهٔ شعب.</w:t>
+        <w:t xml:space="preserve">نقشه و دیکشنری کاملِ دیتابیس سه نرم‌افزار — پیش‌نیازِ استخراج داده.</w:t>
       </w:r>
     </w:p>
     <w:p>
@@ -3464,7 +3464,7 @@
           <w:sz w:val="25"/>
           <w:szCs w:val="25"/>
         </w:rPr>
-        <w:t xml:space="preserve">فاز دوم — مایگریشن و متناظرسازی (Migration &amp; Mapping) | ۲۰ روز</w:t>
+        <w:t xml:space="preserve">فاز دوم — ساخت انبار داده (Data Warehouse) | ۱۰ روز</w:t>
       </w:r>
     </w:p>
     <w:p>
@@ -3484,7 +3484,7 @@
           <w:sz w:val="22"/>
           <w:szCs w:val="22"/>
         </w:rPr>
-        <w:t xml:space="preserve">در این فاز، رکوردهای سه سامانه به یکدیگر «متناظر» می‌شوند تا برای هر عملیات، روایت انبار و روایت حسابداری کنار هم قرار گیرد و مغایرت‌ها آشکار شوند.</w:t>
+        <w:t xml:space="preserve">در این فاز، دادهٔ سه سامانه از همهٔ شعب استخراج، پاک‌سازی و در یک انبار دادهٔ مرکزی و ساخت‌یافته گردآوری می‌شود تا زیربنای یکپارچه‌سازی فراهم گردد.</w:t>
       </w:r>
     </w:p>
     <w:p>
@@ -3507,7 +3507,7 @@
           <w:sz w:val="22"/>
           <w:szCs w:val="22"/>
         </w:rPr>
-        <w:t xml:space="preserve">تعریف کلید مشترک بین دستور کار، خروج انبار و اسناد مالی.</w:t>
+        <w:t xml:space="preserve">شناسایی و مستندسازی منابع داده و ساختار هر سه سامانه در تمام شعب.</w:t>
       </w:r>
     </w:p>
     <w:p>
@@ -3530,7 +3530,7 @@
           <w:sz w:val="22"/>
           <w:szCs w:val="22"/>
         </w:rPr>
-        <w:t xml:space="preserve">پیاده‌سازی موتور مغایرت‌گیری سه‌محوره: اقلام مصرفی ⇄ انبار، صورت‌حساب/درآمد ⇄ حسابداری، هزینه و تنخواه ⇄ حسابداری.</w:t>
+        <w:t xml:space="preserve">پیاده‌سازی فرآیند استخراج و بارگذاری داده (ETL) از سه سیستم.</w:t>
       </w:r>
     </w:p>
     <w:p>
@@ -3553,7 +3553,7 @@
           <w:sz w:val="22"/>
           <w:szCs w:val="22"/>
         </w:rPr>
-        <w:t xml:space="preserve">کشف و دسته‌بندی مغایرت‌ها: قلم کسرنشده، سند مالی مفقود، درآمد بدون دستور کار، مغایرت تنخواه، خطای ثبت.</w:t>
+        <w:t xml:space="preserve">پاک‌سازی، استانداردسازی و یکدست‌سازی داده‌ها (تاریخ، کد کالا، کد شعبه، مشتری).</w:t>
       </w:r>
     </w:p>
     <w:p>
@@ -3576,7 +3576,83 @@
           <w:sz w:val="22"/>
           <w:szCs w:val="22"/>
         </w:rPr>
-        <w:t xml:space="preserve">مایگریشن و تطبیق دادهٔ تاریخی برای تحلیل روند.</w:t>
+        <w:t xml:space="preserve">راه‌اندازی انبار دادهٔ مرکزی به‌عنوان منبع واحد حقیقت.</w:t>
+      </w:r>
+    </w:p>
+    <w:p>
+      <w:pPr>
+        <w:bidi/>
+        <w:spacing w:after="60" w:before="0" w:line="300"/>
+        <w:jc w:val="right"/>
+      </w:pPr>
+      <w:r>
+        <w:rPr>
+          <w:rFonts w:ascii="Tahoma" w:cs="Tahoma" w:eastAsia="Tahoma" w:hAnsi="Tahoma"/>
+          <w:b/>
+          <w:bCs/>
+          <w:color w:val="0E7C86"/>
+          <w:sz w:val="22"/>
+          <w:szCs w:val="22"/>
+        </w:rPr>
+        <w:t xml:space="preserve">خروجی فاز: </w:t>
+      </w:r>
+      <w:r>
+        <w:rPr>
+          <w:rFonts w:ascii="Tahoma" w:cs="Tahoma" w:eastAsia="Tahoma" w:hAnsi="Tahoma"/>
+          <w:b w:val="false"/>
+          <w:bCs w:val="false"/>
+          <w:color w:val="1A1A1A"/>
+          <w:sz w:val="22"/>
+          <w:szCs w:val="22"/>
+        </w:rPr>
+        <w:t xml:space="preserve">انبار دادهٔ عملیاتیِ یکپارچه از هر سه سامانه و همهٔ شعب.</w:t>
+      </w:r>
+    </w:p>
+    <w:p>
+      <w:pPr>
+        <w:spacing w:after="80"/>
+      </w:pPr>
+      <w:r>
+        <w:t xml:space="preserve"/>
+      </w:r>
+    </w:p>
+    <w:p>
+      <w:pPr>
+        <w:pStyle w:val="Heading2"/>
+        <w:bidi/>
+        <w:spacing w:after="100" w:before="200" w:line="300"/>
+        <w:jc w:val="right"/>
+      </w:pPr>
+      <w:r>
+        <w:rPr>
+          <w:rFonts w:ascii="Tahoma" w:cs="Tahoma" w:eastAsia="Tahoma" w:hAnsi="Tahoma"/>
+          <w:b/>
+          <w:bCs/>
+          <w:color w:val="0E7C86"/>
+          <w:sz w:val="25"/>
+          <w:szCs w:val="25"/>
+        </w:rPr>
+        <w:t xml:space="preserve">فاز سوم — مایگریشن و متناظرسازی (Migration &amp; Mapping) | ۲۰ روز</w:t>
+      </w:r>
+    </w:p>
+    <w:p>
+      <w:pPr>
+        <w:bidi/>
+        <w:spacing w:after="120" w:before="0" w:line="300"/>
+        <w:jc w:val="right"/>
+      </w:pPr>
+      <w:r>
+        <w:rPr>
+          <w:rFonts w:ascii="Tahoma" w:cs="Tahoma" w:eastAsia="Tahoma" w:hAnsi="Tahoma"/>
+          <w:b w:val="false"/>
+          <w:bCs w:val="false"/>
+          <w:i w:val="false"/>
+          <w:iCs w:val="false"/>
+          <w:color w:val="1A1A1A"/>
+          <w:sz w:val="22"/>
+          <w:szCs w:val="22"/>
+        </w:rPr>
+        <w:t xml:space="preserve">در این فاز، رکوردهای سه سامانه به یکدیگر «متناظر» می‌شوند تا برای هر عملیات، روایت انبار و روایت حسابداری کنار هم قرار گیرد و مغایرت‌ها آشکار شوند.</w:t>
       </w:r>
     </w:p>
     <w:p>
@@ -3599,6 +3675,98 @@
           <w:sz w:val="22"/>
           <w:szCs w:val="22"/>
         </w:rPr>
+        <w:t xml:space="preserve">تعریف کلید مشترک بین دستور کار، خروج انبار و اسناد مالی.</w:t>
+      </w:r>
+    </w:p>
+    <w:p>
+      <w:pPr>
+        <w:pStyle w:val="ListParagraph"/>
+        <w:numPr>
+          <w:ilvl w:val="0"/>
+          <w:numId w:val="2"/>
+        </w:numPr>
+        <w:bidi/>
+        <w:spacing w:after="70" w:line="290"/>
+        <w:jc w:val="right"/>
+      </w:pPr>
+      <w:r>
+        <w:rPr>
+          <w:rFonts w:ascii="Tahoma" w:cs="Tahoma" w:eastAsia="Tahoma" w:hAnsi="Tahoma"/>
+          <w:b w:val="false"/>
+          <w:bCs w:val="false"/>
+          <w:color w:val="1A1A1A"/>
+          <w:sz w:val="22"/>
+          <w:szCs w:val="22"/>
+        </w:rPr>
+        <w:t xml:space="preserve">پیاده‌سازی موتور مغایرت‌گیری سه‌محوره: اقلام مصرفی ⇄ انبار، صورت‌حساب/درآمد ⇄ حسابداری، هزینه و تنخواه ⇄ حسابداری.</w:t>
+      </w:r>
+    </w:p>
+    <w:p>
+      <w:pPr>
+        <w:pStyle w:val="ListParagraph"/>
+        <w:numPr>
+          <w:ilvl w:val="0"/>
+          <w:numId w:val="2"/>
+        </w:numPr>
+        <w:bidi/>
+        <w:spacing w:after="70" w:line="290"/>
+        <w:jc w:val="right"/>
+      </w:pPr>
+      <w:r>
+        <w:rPr>
+          <w:rFonts w:ascii="Tahoma" w:cs="Tahoma" w:eastAsia="Tahoma" w:hAnsi="Tahoma"/>
+          <w:b w:val="false"/>
+          <w:bCs w:val="false"/>
+          <w:color w:val="1A1A1A"/>
+          <w:sz w:val="22"/>
+          <w:szCs w:val="22"/>
+        </w:rPr>
+        <w:t xml:space="preserve">کشف و دسته‌بندی مغایرت‌ها: قلم کسرنشده، سند مالی مفقود، درآمد بدون دستور کار، مغایرت تنخواه، خطای ثبت.</w:t>
+      </w:r>
+    </w:p>
+    <w:p>
+      <w:pPr>
+        <w:pStyle w:val="ListParagraph"/>
+        <w:numPr>
+          <w:ilvl w:val="0"/>
+          <w:numId w:val="2"/>
+        </w:numPr>
+        <w:bidi/>
+        <w:spacing w:after="70" w:line="290"/>
+        <w:jc w:val="right"/>
+      </w:pPr>
+      <w:r>
+        <w:rPr>
+          <w:rFonts w:ascii="Tahoma" w:cs="Tahoma" w:eastAsia="Tahoma" w:hAnsi="Tahoma"/>
+          <w:b w:val="false"/>
+          <w:bCs w:val="false"/>
+          <w:color w:val="1A1A1A"/>
+          <w:sz w:val="22"/>
+          <w:szCs w:val="22"/>
+        </w:rPr>
+        <w:t xml:space="preserve">مایگریشن و تطبیق دادهٔ تاریخی برای تحلیل روند.</w:t>
+      </w:r>
+    </w:p>
+    <w:p>
+      <w:pPr>
+        <w:pStyle w:val="ListParagraph"/>
+        <w:numPr>
+          <w:ilvl w:val="0"/>
+          <w:numId w:val="2"/>
+        </w:numPr>
+        <w:bidi/>
+        <w:spacing w:after="70" w:line="290"/>
+        <w:jc w:val="right"/>
+      </w:pPr>
+      <w:r>
+        <w:rPr>
+          <w:rFonts w:ascii="Tahoma" w:cs="Tahoma" w:eastAsia="Tahoma" w:hAnsi="Tahoma"/>
+          <w:b w:val="false"/>
+          <w:bCs w:val="false"/>
+          <w:color w:val="1A1A1A"/>
+          <w:sz w:val="22"/>
+          <w:szCs w:val="22"/>
+        </w:rPr>
         <w:t xml:space="preserve">اعتبارسنجی نتایج با نمونه‌گیری و تأیید کارفرما.</w:t>
       </w:r>
     </w:p>
@@ -3655,7 +3823,7 @@
           <w:sz w:val="25"/>
           <w:szCs w:val="25"/>
         </w:rPr>
-        <w:t xml:space="preserve">فاز سوم — پلتفرم BI و داشبوردها | ۱۵ روز</w:t>
+        <w:t xml:space="preserve">فاز چهارم — پلتفرم BI و داشبوردها | ۱۵ روز</w:t>
       </w:r>
     </w:p>
     <w:p>
@@ -4958,7 +5126,7 @@
                 <w:sz w:val="21"/>
                 <w:szCs w:val="21"/>
               </w:rPr>
-              <w:t xml:space="preserve">انبار دادهٔ مرکزی یکپارچه + مستندات مدل داده و فرآیند ETL</w:t>
+              <w:t xml:space="preserve">نقشه و دیکشنری کاملِ دیتابیس سه نرم‌افزار</w:t>
             </w:r>
           </w:p>
         </w:tc>
@@ -5022,7 +5190,7 @@
                 <w:sz w:val="21"/>
                 <w:szCs w:val="21"/>
               </w:rPr>
-              <w:t xml:space="preserve">موتور و گزارش مغایرت‌گیری سه‌جانبهٔ خودکار + دادهٔ تاریخی متناظرشده</w:t>
+              <w:t xml:space="preserve">انبار دادهٔ مرکزی یکپارچه + مستندات مدل داده و فرآیند ETL</w:t>
             </w:r>
           </w:p>
         </w:tc>
@@ -5086,7 +5254,7 @@
                 <w:sz w:val="21"/>
                 <w:szCs w:val="21"/>
               </w:rPr>
-              <w:t xml:space="preserve">پلتفرم BI با داشبوردهای عملیاتی، انباری، مالی و مغایرت‌گیری + آموزش کاربران</w:t>
+              <w:t xml:space="preserve">موتور و گزارش مغایرت‌گیری سه‌جانبهٔ خودکار + دادهٔ تاریخی متناظرشده</w:t>
             </w:r>
           </w:p>
         </w:tc>
@@ -5119,7 +5287,7 @@
                 <w:sz w:val="21"/>
                 <w:szCs w:val="21"/>
               </w:rPr>
-              <w:t xml:space="preserve">پشتیبانی</w:t>
+              <w:t xml:space="preserve">فاز ۴</w:t>
             </w:r>
           </w:p>
         </w:tc>
@@ -5127,6 +5295,70 @@
           <w:tcPr>
             <w:tcW w:type="dxa" w:w="7560"/>
             <w:shd w:fill="FFFFFF" w:color="auto" w:val="clear"/>
+            <w:tcMar>
+              <w:top w:type="dxa" w:w="80"/>
+              <w:left w:type="dxa" w:w="90"/>
+              <w:bottom w:type="dxa" w:w="80"/>
+              <w:right w:type="dxa" w:w="90"/>
+            </w:tcMar>
+            <w:vAlign w:val="center"/>
+          </w:tcPr>
+          <w:p>
+            <w:pPr>
+              <w:bidi/>
+              <w:spacing w:after="0" w:line="280"/>
+              <w:jc w:val="right"/>
+            </w:pPr>
+            <w:r>
+              <w:rPr>
+                <w:rFonts w:ascii="Tahoma" w:cs="Tahoma" w:eastAsia="Tahoma" w:hAnsi="Tahoma"/>
+                <w:b w:val="false"/>
+                <w:bCs w:val="false"/>
+                <w:color w:val="1A1A1A"/>
+                <w:sz w:val="21"/>
+                <w:szCs w:val="21"/>
+              </w:rPr>
+              <w:t xml:space="preserve">پلتفرم BI با داشبوردهای عملیاتی، انباری، مالی و مغایرت‌گیری + آموزش کاربران</w:t>
+            </w:r>
+          </w:p>
+        </w:tc>
+      </w:tr>
+      <w:tr>
+        <w:tc>
+          <w:tcPr>
+            <w:tcW w:type="dxa" w:w="1800"/>
+            <w:shd w:fill="F5F9FB" w:color="auto" w:val="clear"/>
+            <w:tcMar>
+              <w:top w:type="dxa" w:w="80"/>
+              <w:left w:type="dxa" w:w="90"/>
+              <w:bottom w:type="dxa" w:w="80"/>
+              <w:right w:type="dxa" w:w="90"/>
+            </w:tcMar>
+            <w:vAlign w:val="center"/>
+          </w:tcPr>
+          <w:p>
+            <w:pPr>
+              <w:bidi/>
+              <w:spacing w:after="0" w:line="280"/>
+              <w:jc w:val="center"/>
+            </w:pPr>
+            <w:r>
+              <w:rPr>
+                <w:rFonts w:ascii="Tahoma" w:cs="Tahoma" w:eastAsia="Tahoma" w:hAnsi="Tahoma"/>
+                <w:b/>
+                <w:bCs/>
+                <w:color w:val="1A1A1A"/>
+                <w:sz w:val="21"/>
+                <w:szCs w:val="21"/>
+              </w:rPr>
+              <w:t xml:space="preserve">پشتیبانی</w:t>
+            </w:r>
+          </w:p>
+        </w:tc>
+        <w:tc>
+          <w:tcPr>
+            <w:tcW w:type="dxa" w:w="7560"/>
+            <w:shd w:fill="F5F9FB" w:color="auto" w:val="clear"/>
             <w:tcMar>
               <w:top w:type="dxa" w:w="80"/>
               <w:left w:type="dxa" w:w="90"/>
@@ -5394,7 +5626,7 @@
                 <w:sz w:val="21"/>
                 <w:szCs w:val="21"/>
               </w:rPr>
-              <w:t xml:space="preserve">ساخت انبار داده</w:t>
+              <w:t xml:space="preserve">رمزگشایی دیتابیس سه نرم‌افزار</w:t>
             </w:r>
           </w:p>
         </w:tc>
@@ -5520,7 +5752,7 @@
                 <w:sz w:val="21"/>
                 <w:szCs w:val="21"/>
               </w:rPr>
-              <w:t xml:space="preserve">مایگریشن و متناظرسازی</w:t>
+              <w:t xml:space="preserve">ساخت انبار داده</w:t>
             </w:r>
           </w:p>
         </w:tc>
@@ -5551,7 +5783,7 @@
                 <w:sz w:val="21"/>
                 <w:szCs w:val="21"/>
               </w:rPr>
-              <w:t xml:space="preserve">۲۰ روز</w:t>
+              <w:t xml:space="preserve">۱۰ روز</w:t>
             </w:r>
           </w:p>
         </w:tc>
@@ -5582,7 +5814,7 @@
                 <w:sz w:val="21"/>
                 <w:szCs w:val="21"/>
               </w:rPr>
-              <w:t xml:space="preserve">روز ۱۱ تا ۳۰</w:t>
+              <w:t xml:space="preserve">روز ۱۱ تا ۲۰</w:t>
             </w:r>
           </w:p>
         </w:tc>
@@ -5646,7 +5878,7 @@
                 <w:sz w:val="21"/>
                 <w:szCs w:val="21"/>
               </w:rPr>
-              <w:t xml:space="preserve">پلتفرم BI و داشبوردها</w:t>
+              <w:t xml:space="preserve">مایگریشن و متناظرسازی</w:t>
             </w:r>
           </w:p>
         </w:tc>
@@ -5677,7 +5909,7 @@
                 <w:sz w:val="21"/>
                 <w:szCs w:val="21"/>
               </w:rPr>
-              <w:t xml:space="preserve">۱۵ روز</w:t>
+              <w:t xml:space="preserve">۲۰ روز</w:t>
             </w:r>
           </w:p>
         </w:tc>
@@ -5708,7 +5940,7 @@
                 <w:sz w:val="21"/>
                 <w:szCs w:val="21"/>
               </w:rPr>
-              <w:t xml:space="preserve">روز ۳۱ تا ۴۵</w:t>
+              <w:t xml:space="preserve">روز ۲۱ تا ۴۰</w:t>
             </w:r>
           </w:p>
         </w:tc>
@@ -5741,7 +5973,7 @@
                 <w:sz w:val="21"/>
                 <w:szCs w:val="21"/>
               </w:rPr>
-              <w:t xml:space="preserve">جمع</w:t>
+              <w:t xml:space="preserve">فاز ۴</w:t>
             </w:r>
           </w:p>
         </w:tc>
@@ -5772,7 +6004,7 @@
                 <w:sz w:val="21"/>
                 <w:szCs w:val="21"/>
               </w:rPr>
-              <w:t xml:space="preserve">کل اجرای پروژه</w:t>
+              <w:t xml:space="preserve">پلتفرم BI و داشبوردها</w:t>
             </w:r>
           </w:p>
         </w:tc>
@@ -5803,7 +6035,7 @@
                 <w:sz w:val="21"/>
                 <w:szCs w:val="21"/>
               </w:rPr>
-              <w:t xml:space="preserve">۴۵ روز</w:t>
+              <w:t xml:space="preserve">۱۵ روز</w:t>
             </w:r>
           </w:p>
         </w:tc>
@@ -5811,6 +6043,132 @@
           <w:tcPr>
             <w:tcW w:type="dxa" w:w="1800"/>
             <w:shd w:fill="FFFFFF" w:color="auto" w:val="clear"/>
+            <w:tcMar>
+              <w:top w:type="dxa" w:w="80"/>
+              <w:left w:type="dxa" w:w="90"/>
+              <w:bottom w:type="dxa" w:w="80"/>
+              <w:right w:type="dxa" w:w="90"/>
+            </w:tcMar>
+            <w:vAlign w:val="center"/>
+          </w:tcPr>
+          <w:p>
+            <w:pPr>
+              <w:bidi/>
+              <w:spacing w:after="0" w:line="280"/>
+              <w:jc w:val="center"/>
+            </w:pPr>
+            <w:r>
+              <w:rPr>
+                <w:rFonts w:ascii="Tahoma" w:cs="Tahoma" w:eastAsia="Tahoma" w:hAnsi="Tahoma"/>
+                <w:b w:val="false"/>
+                <w:bCs w:val="false"/>
+                <w:color w:val="1A1A1A"/>
+                <w:sz w:val="21"/>
+                <w:szCs w:val="21"/>
+              </w:rPr>
+              <w:t xml:space="preserve">روز ۴۱ تا ۵۵</w:t>
+            </w:r>
+          </w:p>
+        </w:tc>
+      </w:tr>
+      <w:tr>
+        <w:tc>
+          <w:tcPr>
+            <w:tcW w:type="dxa" w:w="1500"/>
+            <w:shd w:fill="F5F9FB" w:color="auto" w:val="clear"/>
+            <w:tcMar>
+              <w:top w:type="dxa" w:w="80"/>
+              <w:left w:type="dxa" w:w="90"/>
+              <w:bottom w:type="dxa" w:w="80"/>
+              <w:right w:type="dxa" w:w="90"/>
+            </w:tcMar>
+            <w:vAlign w:val="center"/>
+          </w:tcPr>
+          <w:p>
+            <w:pPr>
+              <w:bidi/>
+              <w:spacing w:after="0" w:line="280"/>
+              <w:jc w:val="center"/>
+            </w:pPr>
+            <w:r>
+              <w:rPr>
+                <w:rFonts w:ascii="Tahoma" w:cs="Tahoma" w:eastAsia="Tahoma" w:hAnsi="Tahoma"/>
+                <w:b/>
+                <w:bCs/>
+                <w:color w:val="1A1A1A"/>
+                <w:sz w:val="21"/>
+                <w:szCs w:val="21"/>
+              </w:rPr>
+              <w:t xml:space="preserve">جمع</w:t>
+            </w:r>
+          </w:p>
+        </w:tc>
+        <w:tc>
+          <w:tcPr>
+            <w:tcW w:type="dxa" w:w="4160"/>
+            <w:shd w:fill="F5F9FB" w:color="auto" w:val="clear"/>
+            <w:tcMar>
+              <w:top w:type="dxa" w:w="80"/>
+              <w:left w:type="dxa" w:w="90"/>
+              <w:bottom w:type="dxa" w:w="80"/>
+              <w:right w:type="dxa" w:w="90"/>
+            </w:tcMar>
+            <w:vAlign w:val="center"/>
+          </w:tcPr>
+          <w:p>
+            <w:pPr>
+              <w:bidi/>
+              <w:spacing w:after="0" w:line="280"/>
+              <w:jc w:val="right"/>
+            </w:pPr>
+            <w:r>
+              <w:rPr>
+                <w:rFonts w:ascii="Tahoma" w:cs="Tahoma" w:eastAsia="Tahoma" w:hAnsi="Tahoma"/>
+                <w:b w:val="false"/>
+                <w:bCs w:val="false"/>
+                <w:color w:val="1A1A1A"/>
+                <w:sz w:val="21"/>
+                <w:szCs w:val="21"/>
+              </w:rPr>
+              <w:t xml:space="preserve">کل اجرای پروژه</w:t>
+            </w:r>
+          </w:p>
+        </w:tc>
+        <w:tc>
+          <w:tcPr>
+            <w:tcW w:type="dxa" w:w="1900"/>
+            <w:shd w:fill="F5F9FB" w:color="auto" w:val="clear"/>
+            <w:tcMar>
+              <w:top w:type="dxa" w:w="80"/>
+              <w:left w:type="dxa" w:w="90"/>
+              <w:bottom w:type="dxa" w:w="80"/>
+              <w:right w:type="dxa" w:w="90"/>
+            </w:tcMar>
+            <w:vAlign w:val="center"/>
+          </w:tcPr>
+          <w:p>
+            <w:pPr>
+              <w:bidi/>
+              <w:spacing w:after="0" w:line="280"/>
+              <w:jc w:val="center"/>
+            </w:pPr>
+            <w:r>
+              <w:rPr>
+                <w:rFonts w:ascii="Tahoma" w:cs="Tahoma" w:eastAsia="Tahoma" w:hAnsi="Tahoma"/>
+                <w:b w:val="false"/>
+                <w:bCs w:val="false"/>
+                <w:color w:val="1A1A1A"/>
+                <w:sz w:val="21"/>
+                <w:szCs w:val="21"/>
+              </w:rPr>
+              <w:t xml:space="preserve">۵۵ روز</w:t>
+            </w:r>
+          </w:p>
+        </w:tc>
+        <w:tc>
+          <w:tcPr>
+            <w:tcW w:type="dxa" w:w="1800"/>
+            <w:shd w:fill="F5F9FB" w:color="auto" w:val="clear"/>
             <w:tcMar>
               <w:top w:type="dxa" w:w="80"/>
               <w:left w:type="dxa" w:w="90"/>
@@ -6379,7 +6737,7 @@
                 <w:sz w:val="21"/>
                 <w:szCs w:val="21"/>
               </w:rPr>
-              <w:t xml:space="preserve">اجرای فاز اول — ساخت انبار داده (۱۰ روز)</w:t>
+              <w:t xml:space="preserve">اجرای فاز اول — رمزگشایی دیتابیس سه نرم‌افزار (۱۰ روز)</w:t>
             </w:r>
           </w:p>
         </w:tc>
@@ -6410,7 +6768,7 @@
                 <w:sz w:val="21"/>
                 <w:szCs w:val="21"/>
               </w:rPr>
-              <w:t xml:space="preserve">۸۴٬۵۰۰٬۰۰۰</w:t>
+              <w:t xml:space="preserve">۵۵٬۰۰۰٬۰۰۰</w:t>
             </w:r>
           </w:p>
         </w:tc>
@@ -6474,7 +6832,7 @@
                 <w:sz w:val="21"/>
                 <w:szCs w:val="21"/>
               </w:rPr>
-              <w:t xml:space="preserve">اجرای فاز دوم — مایگریشن و متناظرسازی (۲۰ روز)</w:t>
+              <w:t xml:space="preserve">اجرای فاز دوم — ساخت انبار داده (۱۰ روز)</w:t>
             </w:r>
           </w:p>
         </w:tc>
@@ -6505,7 +6863,7 @@
                 <w:sz w:val="21"/>
                 <w:szCs w:val="21"/>
               </w:rPr>
-              <w:t xml:space="preserve">۱۴۳٬۰۰۰٬۰۰۰</w:t>
+              <w:t xml:space="preserve">۸۴٬۵۰۰٬۰۰۰</w:t>
             </w:r>
           </w:p>
         </w:tc>
@@ -6569,7 +6927,7 @@
                 <w:sz w:val="21"/>
                 <w:szCs w:val="21"/>
               </w:rPr>
-              <w:t xml:space="preserve">اجرای فاز سوم — پلتفرم BI و داشبوردها (۱۵ روز)</w:t>
+              <w:t xml:space="preserve">اجرای فاز سوم — مایگریشن و متناظرسازی (۲۰ روز)</w:t>
             </w:r>
           </w:p>
         </w:tc>
@@ -6600,7 +6958,7 @@
                 <w:sz w:val="21"/>
                 <w:szCs w:val="21"/>
               </w:rPr>
-              <w:t xml:space="preserve">۱۱۷٬۰۰۰٬۰۰۰</w:t>
+              <w:t xml:space="preserve">۱۴۳٬۰۰۰٬۰۰۰</w:t>
             </w:r>
           </w:p>
         </w:tc>
@@ -6633,7 +6991,7 @@
                 <w:sz w:val="21"/>
                 <w:szCs w:val="21"/>
               </w:rPr>
-              <w:t xml:space="preserve"/>
+              <w:t xml:space="preserve">۴</w:t>
             </w:r>
           </w:p>
         </w:tc>
@@ -6664,7 +7022,7 @@
                 <w:sz w:val="21"/>
                 <w:szCs w:val="21"/>
               </w:rPr>
-              <w:t xml:space="preserve">جمع کل قرارداد اجرا (سه فاز)</w:t>
+              <w:t xml:space="preserve">اجرای فاز چهارم — پلتفرم BI و داشبوردها (۱۵ روز)</w:t>
             </w:r>
           </w:p>
         </w:tc>
@@ -6695,7 +7053,7 @@
                 <w:sz w:val="21"/>
                 <w:szCs w:val="21"/>
               </w:rPr>
-              <w:t xml:space="preserve">۳۴۴٬۵۰۰٬۰۰۰</w:t>
+              <w:t xml:space="preserve">۱۱۷٬۰۰۰٬۰۰۰</w:t>
             </w:r>
           </w:p>
         </w:tc>
@@ -6759,7 +7117,7 @@
                 <w:sz w:val="21"/>
                 <w:szCs w:val="21"/>
               </w:rPr>
-              <w:t xml:space="preserve">پشتیبانی تا یک ماه پس از تحویل</w:t>
+              <w:t xml:space="preserve">جمع کل قرارداد اجرا (چهار فاز)</w:t>
             </w:r>
           </w:p>
         </w:tc>
@@ -6767,6 +7125,101 @@
           <w:tcPr>
             <w:tcW w:type="dxa" w:w="2200"/>
             <w:shd w:fill="F5F9FB" w:color="auto" w:val="clear"/>
+            <w:tcMar>
+              <w:top w:type="dxa" w:w="80"/>
+              <w:left w:type="dxa" w:w="90"/>
+              <w:bottom w:type="dxa" w:w="80"/>
+              <w:right w:type="dxa" w:w="90"/>
+            </w:tcMar>
+            <w:vAlign w:val="center"/>
+          </w:tcPr>
+          <w:p>
+            <w:pPr>
+              <w:bidi/>
+              <w:spacing w:after="0" w:line="280"/>
+              <w:jc w:val="center"/>
+            </w:pPr>
+            <w:r>
+              <w:rPr>
+                <w:rFonts w:ascii="Tahoma" w:cs="Tahoma" w:eastAsia="Tahoma" w:hAnsi="Tahoma"/>
+                <w:b w:val="false"/>
+                <w:bCs w:val="false"/>
+                <w:color w:val="1A1A1A"/>
+                <w:sz w:val="21"/>
+                <w:szCs w:val="21"/>
+              </w:rPr>
+              <w:t xml:space="preserve">۳۹۹٬۵۰۰٬۰۰۰</w:t>
+            </w:r>
+          </w:p>
+        </w:tc>
+      </w:tr>
+      <w:tr>
+        <w:tc>
+          <w:tcPr>
+            <w:tcW w:type="dxa" w:w="1100"/>
+            <w:shd w:fill="FFFFFF" w:color="auto" w:val="clear"/>
+            <w:tcMar>
+              <w:top w:type="dxa" w:w="80"/>
+              <w:left w:type="dxa" w:w="90"/>
+              <w:bottom w:type="dxa" w:w="80"/>
+              <w:right w:type="dxa" w:w="90"/>
+            </w:tcMar>
+            <w:vAlign w:val="center"/>
+          </w:tcPr>
+          <w:p>
+            <w:pPr>
+              <w:bidi/>
+              <w:spacing w:after="0" w:line="280"/>
+              <w:jc w:val="center"/>
+            </w:pPr>
+            <w:r>
+              <w:rPr>
+                <w:rFonts w:ascii="Tahoma" w:cs="Tahoma" w:eastAsia="Tahoma" w:hAnsi="Tahoma"/>
+                <w:b w:val="false"/>
+                <w:bCs w:val="false"/>
+                <w:color w:val="1A1A1A"/>
+                <w:sz w:val="21"/>
+                <w:szCs w:val="21"/>
+              </w:rPr>
+              <w:t xml:space="preserve"/>
+            </w:r>
+          </w:p>
+        </w:tc>
+        <w:tc>
+          <w:tcPr>
+            <w:tcW w:type="dxa" w:w="6060"/>
+            <w:shd w:fill="FFFFFF" w:color="auto" w:val="clear"/>
+            <w:tcMar>
+              <w:top w:type="dxa" w:w="80"/>
+              <w:left w:type="dxa" w:w="90"/>
+              <w:bottom w:type="dxa" w:w="80"/>
+              <w:right w:type="dxa" w:w="90"/>
+            </w:tcMar>
+            <w:vAlign w:val="center"/>
+          </w:tcPr>
+          <w:p>
+            <w:pPr>
+              <w:bidi/>
+              <w:spacing w:after="0" w:line="280"/>
+              <w:jc w:val="right"/>
+            </w:pPr>
+            <w:r>
+              <w:rPr>
+                <w:rFonts w:ascii="Tahoma" w:cs="Tahoma" w:eastAsia="Tahoma" w:hAnsi="Tahoma"/>
+                <w:b w:val="false"/>
+                <w:bCs w:val="false"/>
+                <w:color w:val="1A1A1A"/>
+                <w:sz w:val="21"/>
+                <w:szCs w:val="21"/>
+              </w:rPr>
+              <w:t xml:space="preserve">پشتیبانی تا یک ماه پس از تحویل</w:t>
+            </w:r>
+          </w:p>
+        </w:tc>
+        <w:tc>
+          <w:tcPr>
+            <w:tcW w:type="dxa" w:w="2200"/>
+            <w:shd w:fill="FFFFFF" w:color="auto" w:val="clear"/>
             <w:tcMar>
               <w:top w:type="dxa" w:w="80"/>
               <w:left w:type="dxa" w:w="90"/>
@@ -6821,7 +7274,7 @@
           <w:sz w:val="20"/>
           <w:szCs w:val="20"/>
         </w:rPr>
-        <w:t xml:space="preserve">پرداخت مبلغ هر فاز متناسب با تحویل همان فاز انجام می‌شود؛ مبلغ کل قرارداد اجرا ۳۴۴٫۵ میلیون تومان است.</w:t>
+        <w:t xml:space="preserve">پرداخت مبلغ هر فاز متناسب با تحویل همان فاز انجام می‌شود؛ مبلغ کل قرارداد اجرا ۳۹۹٫۵ میلیون تومان است.</w:t>
       </w:r>
     </w:p>
     <w:p>
@@ -6990,7 +7443,7 @@
           <w:sz w:val="22"/>
           <w:szCs w:val="22"/>
         </w:rPr>
-        <w:t xml:space="preserve">این پروپوزال یک مسیر روشن و مرحله‌ای برای عبور از وضعیت «سه سامانهٔ ناهماهنگ» به وضعیت «یک تصویر واحد، شفاف و قابل‌کاوش» ارائه می‌کند. در پایان ۴۵ روز، مدیریت شرکت صنعتی و خدمات مهندسی ایران خواهد توانست هم‌خوانی انبار، عملیات و حسابداری را به‌صورت لحظه‌ای پایش کند و برای هر پرسش تازه، خودش داده را کاوش کند.</w:t>
+        <w:t xml:space="preserve">این پروپوزال یک مسیر روشن و مرحله‌ای برای عبور از وضعیت «سه سامانهٔ ناهماهنگ» به وضعیت «یک تصویر واحد، شفاف و قابل‌کاوش» ارائه می‌کند. در پایان ۵۵ روز، مدیریت شرکت صنعتی و خدمات مهندسی ایران خواهد توانست هم‌خوانی انبار، عملیات و حسابداری را به‌صورت لحظه‌ای پایش کند و برای هر پرسش تازه، خودش داده را کاوش کند.</w:t>
       </w:r>
     </w:p>
     <w:p>

</xml_diff>